<commit_message>
feat: add analysis report, update documentation, and exclude additional key extensions from version control
</commit_message>
<xml_diff>
--- a/CA-CS-M-01_Manual_de_usuario_ConsultaSmart_Admin.docx
+++ b/CA-CS-M-01_Manual_de_usuario_ConsultaSmart_Admin.docx
@@ -31,7 +31,7 @@
           <w:i/>
           <w:iCs/>
         </w:rPr>
-        <w:t xml:space="preserve">Configuración de chatbots multitenant, generación de prompts, guardrails y gestión de usuarios</w:t>
+        <w:t xml:space="preserve">Configuración de chatbots multitenant, generación de prompts, guardrails, LLM por tema, regresión de prompts, observabilidad y gestión de usuarios</w:t>
       </w:r>
     </w:p>
     <w:tbl>
@@ -301,7 +301,7 @@
                 <w:sz w:val="21"/>
                 <w:szCs w:val="21"/>
               </w:rPr>
-              <w:t xml:space="preserve">1.0</w:t>
+              <w:t xml:space="preserve">1.1</w:t>
             </w:r>
           </w:p>
         </w:tc>
@@ -1218,6 +1218,70 @@
     </w:p>
     <w:p>
       <w:pPr>
+        <w:pStyle w:val="TDC3"/>
+        <w:tabs>
+          <w:tab w:val="right" w:leader="dot" w:pos="9350"/>
+        </w:tabs>
+        <w:rPr>
+          <w:noProof/>
+        </w:rPr>
+      </w:pPr>
+      <w:hyperlink w:anchor="_Toc_CS_024" w:history="1">
+        <w:r>
+          <w:rPr>
+            <w:rStyle w:val="Hipervnculo"/>
+            <w:noProof/>
+          </w:rPr>
+          <w:t>4.13 Batería de Regresión de Prompts</w:t>
+        </w:r>
+        <w:r>
+          <w:rPr>
+            <w:noProof/>
+          </w:rPr>
+          <w:tab/>
+        </w:r>
+        <w:r>
+          <w:rPr>
+            <w:noProof/>
+          </w:rPr>
+          <w:t>6</w:t>
+        </w:r>
+      </w:hyperlink>
+    </w:p>
+    <w:p>
+      <w:pPr>
+        <w:pStyle w:val="TDC3"/>
+        <w:tabs>
+          <w:tab w:val="right" w:leader="dot" w:pos="9350"/>
+        </w:tabs>
+        <w:rPr>
+          <w:noProof/>
+        </w:rPr>
+      </w:pPr>
+      <w:hyperlink w:anchor="_Toc_CS_025" w:history="1">
+        <w:r>
+          <w:rPr>
+            <w:rStyle w:val="Hipervnculo"/>
+            <w:noProof/>
+          </w:rPr>
+          <w:t>4.14 Observabilidad del motor de IA</w:t>
+        </w:r>
+        <w:r>
+          <w:rPr>
+            <w:noProof/>
+          </w:rPr>
+          <w:tab/>
+        </w:r>
+        <w:r>
+          <w:rPr>
+            <w:noProof/>
+          </w:rPr>
+          <w:t>6</w:t>
+        </w:r>
+      </w:hyperlink>
+    </w:p>
+    <w:p>
+      <w:pPr>
         <w:pStyle w:val="TDC1"/>
         <w:tabs>
           <w:tab w:val="right" w:leader="dot" w:pos="9350"/>
@@ -1226,7 +1290,7 @@
           <w:noProof/>
         </w:rPr>
       </w:pPr>
-      <w:hyperlink w:anchor="_Toc_CS_024" w:history="1">
+      <w:hyperlink w:anchor="_Toc_CS_026" w:history="1">
         <w:r>
           <w:rPr>
             <w:rStyle w:val="Hipervnculo"/>
@@ -1258,7 +1322,7 @@
           <w:noProof/>
         </w:rPr>
       </w:pPr>
-      <w:hyperlink w:anchor="_Toc_CS_025" w:history="1">
+      <w:hyperlink w:anchor="_Toc_CS_027" w:history="1">
         <w:r>
           <w:rPr>
             <w:rStyle w:val="Hipervnculo"/>
@@ -1290,7 +1354,7 @@
           <w:noProof/>
         </w:rPr>
       </w:pPr>
-      <w:hyperlink w:anchor="_Toc_CS_026" w:history="1">
+      <w:hyperlink w:anchor="_Toc_CS_028" w:history="1">
         <w:r>
           <w:rPr>
             <w:rStyle w:val="Hipervnculo"/>
@@ -1906,6 +1970,198 @@
                 <w:sz w:val="21"/>
                 <w:szCs w:val="21"/>
               </w:rPr>
+              <w:t xml:space="preserve">LLM personalizado por tema</w:t>
+            </w:r>
+          </w:p>
+        </w:tc>
+        <w:tc>
+          <w:tcPr>
+            <w:tcW w:w="6300" w:type="dxa"/>
+            <w:tcMar>
+              <w:top w:w="60" w:type="dxa"/>
+              <w:left w:w="120" w:type="dxa"/>
+              <w:bottom w:w="60" w:type="dxa"/>
+              <w:right w:w="120" w:type="dxa"/>
+            </w:tcMar>
+          </w:tcPr>
+          <w:p>
+            <w:pPr>
+              <w:spacing w:line="252" w:lineRule="auto"/>
+            </w:pPr>
+            <w:r>
+              <w:rPr>
+                <w:sz w:val="21"/>
+                <w:szCs w:val="21"/>
+              </w:rPr>
+              <w:t xml:space="preserve">Permite que un tema use un proveedor de IA distinto al global (por ejemplo, una cuenta propia de OpenAI) en vez del motor compartido.</w:t>
+            </w:r>
+          </w:p>
+        </w:tc>
+      </w:tr>
+      <w:tr>
+        <w:tc>
+          <w:tcPr>
+            <w:tcW w:w="3000" w:type="dxa"/>
+            <w:tcMar>
+              <w:top w:w="60" w:type="dxa"/>
+              <w:left w:w="120" w:type="dxa"/>
+              <w:bottom w:w="60" w:type="dxa"/>
+              <w:right w:w="120" w:type="dxa"/>
+            </w:tcMar>
+          </w:tcPr>
+          <w:p>
+            <w:pPr>
+              <w:spacing w:line="252" w:lineRule="auto"/>
+            </w:pPr>
+            <w:r>
+              <w:rPr>
+                <w:sz w:val="21"/>
+                <w:szCs w:val="21"/>
+              </w:rPr>
+              <w:t xml:space="preserve">Batería de regresión de prompts</w:t>
+            </w:r>
+          </w:p>
+        </w:tc>
+        <w:tc>
+          <w:tcPr>
+            <w:tcW w:w="6300" w:type="dxa"/>
+            <w:tcMar>
+              <w:top w:w="60" w:type="dxa"/>
+              <w:left w:w="120" w:type="dxa"/>
+              <w:bottom w:w="60" w:type="dxa"/>
+              <w:right w:w="120" w:type="dxa"/>
+            </w:tcMar>
+          </w:tcPr>
+          <w:p>
+            <w:pPr>
+              <w:spacing w:line="252" w:lineRule="auto"/>
+            </w:pPr>
+            <w:r>
+              <w:rPr>
+                <w:sz w:val="21"/>
+                <w:szCs w:val="21"/>
+              </w:rPr>
+              <w:t xml:space="preserve">Conjunto de preguntas de referencia guardadas por tema, usadas para verificar que un cambio al System Prompt no degrade respuestas que antes eran correctas.</w:t>
+            </w:r>
+          </w:p>
+        </w:tc>
+      </w:tr>
+      <w:tr>
+        <w:tc>
+          <w:tcPr>
+            <w:tcW w:w="3000" w:type="dxa"/>
+            <w:tcMar>
+              <w:top w:w="60" w:type="dxa"/>
+              <w:left w:w="120" w:type="dxa"/>
+              <w:bottom w:w="60" w:type="dxa"/>
+              <w:right w:w="120" w:type="dxa"/>
+            </w:tcMar>
+          </w:tcPr>
+          <w:p>
+            <w:pPr>
+              <w:spacing w:line="252" w:lineRule="auto"/>
+            </w:pPr>
+            <w:r>
+              <w:rPr>
+                <w:sz w:val="21"/>
+                <w:szCs w:val="21"/>
+              </w:rPr>
+              <w:t xml:space="preserve">Observabilidad del enrutador de IA</w:t>
+            </w:r>
+          </w:p>
+        </w:tc>
+        <w:tc>
+          <w:tcPr>
+            <w:tcW w:w="6300" w:type="dxa"/>
+            <w:tcMar>
+              <w:top w:w="60" w:type="dxa"/>
+              <w:left w:w="120" w:type="dxa"/>
+              <w:bottom w:w="60" w:type="dxa"/>
+              <w:right w:w="120" w:type="dxa"/>
+            </w:tcMar>
+          </w:tcPr>
+          <w:p>
+            <w:pPr>
+              <w:spacing w:line="252" w:lineRule="auto"/>
+            </w:pPr>
+            <w:r>
+              <w:rPr>
+                <w:sz w:val="21"/>
+                <w:szCs w:val="21"/>
+              </w:rPr>
+              <w:t xml:space="preserve">Panel de métricas operativas: proveedores de IA activos, tasa de satisfacción de usuarios y estado de la caché.</w:t>
+            </w:r>
+          </w:p>
+        </w:tc>
+      </w:tr>
+      <w:tr>
+        <w:tc>
+          <w:tcPr>
+            <w:tcW w:w="3000" w:type="dxa"/>
+            <w:tcMar>
+              <w:top w:w="60" w:type="dxa"/>
+              <w:left w:w="120" w:type="dxa"/>
+              <w:bottom w:w="60" w:type="dxa"/>
+              <w:right w:w="120" w:type="dxa"/>
+            </w:tcMar>
+          </w:tcPr>
+          <w:p>
+            <w:pPr>
+              <w:spacing w:line="252" w:lineRule="auto"/>
+            </w:pPr>
+            <w:r>
+              <w:rPr>
+                <w:sz w:val="21"/>
+                <w:szCs w:val="21"/>
+              </w:rPr>
+              <w:t xml:space="preserve">Salud de indexado</w:t>
+            </w:r>
+          </w:p>
+        </w:tc>
+        <w:tc>
+          <w:tcPr>
+            <w:tcW w:w="6300" w:type="dxa"/>
+            <w:tcMar>
+              <w:top w:w="60" w:type="dxa"/>
+              <w:left w:w="120" w:type="dxa"/>
+              <w:bottom w:w="60" w:type="dxa"/>
+              <w:right w:w="120" w:type="dxa"/>
+            </w:tcMar>
+          </w:tcPr>
+          <w:p>
+            <w:pPr>
+              <w:spacing w:line="252" w:lineRule="auto"/>
+            </w:pPr>
+            <w:r>
+              <w:rPr>
+                <w:sz w:val="21"/>
+                <w:szCs w:val="21"/>
+              </w:rPr>
+              <w:t xml:space="preserve">Porcentaje de fragmentos de un documento que sí cuentan con vector de búsqueda real, visible en la sección Documentos RAG.</w:t>
+            </w:r>
+          </w:p>
+        </w:tc>
+      </w:tr>
+      <w:tr>
+        <w:tc>
+          <w:tcPr>
+            <w:tcW w:w="3000" w:type="dxa"/>
+            <w:tcMar>
+              <w:top w:w="60" w:type="dxa"/>
+              <w:left w:w="120" w:type="dxa"/>
+              <w:bottom w:w="60" w:type="dxa"/>
+              <w:right w:w="120" w:type="dxa"/>
+            </w:tcMar>
+          </w:tcPr>
+          <w:p>
+            <w:pPr>
+              <w:spacing w:line="252" w:lineRule="auto"/>
+            </w:pPr>
+            <w:r>
+              <w:rPr>
+                <w:sz w:val="21"/>
+                <w:szCs w:val="21"/>
+              </w:rPr>
               <w:t xml:space="preserve">Rol (admin / user)</w:t>
             </w:r>
           </w:p>
@@ -3130,6 +3386,102 @@
           </w:p>
         </w:tc>
       </w:tr>
+      <w:tr>
+        <w:tc>
+          <w:tcPr>
+            <w:tcW w:w="3000" w:type="dxa"/>
+            <w:tcMar>
+              <w:top w:w="60" w:type="dxa"/>
+              <w:left w:w="120" w:type="dxa"/>
+              <w:bottom w:w="60" w:type="dxa"/>
+              <w:right w:w="120" w:type="dxa"/>
+            </w:tcMar>
+          </w:tcPr>
+          <w:p>
+            <w:pPr>
+              <w:spacing w:line="252" w:lineRule="auto"/>
+            </w:pPr>
+            <w:r>
+              <w:rPr>
+                <w:sz w:val="21"/>
+                <w:szCs w:val="21"/>
+              </w:rPr>
+              <w:t xml:space="preserve">Batería de Regresión de Prompts</w:t>
+            </w:r>
+          </w:p>
+        </w:tc>
+        <w:tc>
+          <w:tcPr>
+            <w:tcW w:w="6300" w:type="dxa"/>
+            <w:tcMar>
+              <w:top w:w="60" w:type="dxa"/>
+              <w:left w:w="120" w:type="dxa"/>
+              <w:bottom w:w="60" w:type="dxa"/>
+              <w:right w:w="120" w:type="dxa"/>
+            </w:tcMar>
+          </w:tcPr>
+          <w:p>
+            <w:pPr>
+              <w:spacing w:line="252" w:lineRule="auto"/>
+            </w:pPr>
+            <w:r>
+              <w:rPr>
+                <w:sz w:val="21"/>
+                <w:szCs w:val="21"/>
+              </w:rPr>
+              <w:t xml:space="preserve">Guarda preguntas de referencia por tema y ejecuta la suite completa para detectar si un cambio de prompt rompió respuestas antes correctas.</w:t>
+            </w:r>
+          </w:p>
+        </w:tc>
+      </w:tr>
+      <w:tr>
+        <w:tc>
+          <w:tcPr>
+            <w:tcW w:w="3000" w:type="dxa"/>
+            <w:tcMar>
+              <w:top w:w="60" w:type="dxa"/>
+              <w:left w:w="120" w:type="dxa"/>
+              <w:bottom w:w="60" w:type="dxa"/>
+              <w:right w:w="120" w:type="dxa"/>
+            </w:tcMar>
+          </w:tcPr>
+          <w:p>
+            <w:pPr>
+              <w:spacing w:line="252" w:lineRule="auto"/>
+            </w:pPr>
+            <w:r>
+              <w:rPr>
+                <w:sz w:val="21"/>
+                <w:szCs w:val="21"/>
+              </w:rPr>
+              <w:t xml:space="preserve">Observabilidad</w:t>
+            </w:r>
+          </w:p>
+        </w:tc>
+        <w:tc>
+          <w:tcPr>
+            <w:tcW w:w="6300" w:type="dxa"/>
+            <w:tcMar>
+              <w:top w:w="60" w:type="dxa"/>
+              <w:left w:w="120" w:type="dxa"/>
+              <w:bottom w:w="60" w:type="dxa"/>
+              <w:right w:w="120" w:type="dxa"/>
+            </w:tcMar>
+          </w:tcPr>
+          <w:p>
+            <w:pPr>
+              <w:spacing w:line="252" w:lineRule="auto"/>
+            </w:pPr>
+            <w:r>
+              <w:rPr>
+                <w:sz w:val="21"/>
+                <w:szCs w:val="21"/>
+              </w:rPr>
+              <w:t xml:space="preserve">Pestaña con métricas del enrutador de IA: proveedores activos, satisfacción de usuarios y estado de la caché.</w:t>
+            </w:r>
+          </w:p>
+        </w:tc>
+      </w:tr>
     </w:tbl>
     <w:p/>
     <w:p>
@@ -3556,6 +3908,27 @@
     </w:p>
     <w:p>
       <w:pPr>
+        <w:tabs>
+          <w:tab w:val="left" w:pos="460"/>
+        </w:tabs>
+        <w:spacing w:after="90" w:line="268" w:lineRule="auto"/>
+        <w:ind w:left="460" w:hanging="460"/>
+      </w:pPr>
+      <w:r>
+        <w:rPr>
+          <w:b/>
+          <w:bCs/>
+          <w:color w:val="14406F"/>
+        </w:rPr>
+        <w:t>5.</w:t>
+      </w:r>
+      <w:r>
+        <w:tab/>
+        <w:t xml:space="preserve">Opcionalmente, en Proveedor de IA seleccionar un motor distinto al global (por ejemplo, una cuenta propia) y capturar su clave de API y, si aplica, el modelo específico.</w:t>
+      </w:r>
+    </w:p>
+    <w:p>
+      <w:pPr>
         <w:pStyle w:val="Ttulo3"/>
       </w:pPr>
       <w:bookmarkStart w:id="1017" w:name="_Toc_CS_017"/>
@@ -4140,89 +4513,350 @@
     </w:p>
     <w:p>
       <w:pPr>
-        <w:pStyle w:val="Ttulo1"/>
+        <w:pStyle w:val="Ttulo3"/>
       </w:pPr>
       <w:bookmarkStart w:id="1024" w:name="_Toc_CS_024"/>
       <w:r>
-        <w:t>5. Preguntas frecuentes</w:t>
+        <w:t>4.13 Batería de Regresión de Prompts</w:t>
       </w:r>
       <w:bookmarkEnd w:id="1024"/>
     </w:p>
     <w:p>
+      <w:pPr>
+        <w:tabs>
+          <w:tab w:val="left" w:pos="460"/>
+        </w:tabs>
+        <w:spacing w:after="90" w:line="268" w:lineRule="auto"/>
+        <w:ind w:left="460" w:hanging="460"/>
+      </w:pPr>
       <w:r>
         <w:rPr>
           <w:b/>
           <w:bCs/>
-        </w:rPr>
-        <w:t xml:space="preserve">¿Necesito una contraseña propia de ConsultaSmart?</w:t>
-      </w:r>
-    </w:p>
-    <w:p>
-      <w:r>
-        <w:t xml:space="preserve">No. El acceso es mediante inicio de sesión único (SSO) contra Authentik, con la cuenta institucional del usuario.</w:t>
-      </w:r>
-    </w:p>
-    <w:p>
+          <w:color w:val="14406F"/>
+        </w:rPr>
+        <w:t>1.</w:t>
+      </w:r>
+      <w:r>
+        <w:tab/>
+        <w:t xml:space="preserve">Debajo del panel de configuración del tema activo, ubicar la sección "Batería de Regresión de System Prompts".</w:t>
+      </w:r>
+    </w:p>
+    <w:p>
+      <w:pPr>
+        <w:tabs>
+          <w:tab w:val="left" w:pos="460"/>
+        </w:tabs>
+        <w:spacing w:after="90" w:line="268" w:lineRule="auto"/>
+        <w:ind w:left="460" w:hanging="460"/>
+      </w:pPr>
       <w:r>
         <w:rPr>
           <w:b/>
           <w:bCs/>
-        </w:rPr>
-        <w:t xml:space="preserve">¿Cualquier usuario que inicie sesión puede administrar los chatbots?</w:t>
-      </w:r>
-    </w:p>
-    <w:p>
-      <w:r>
-        <w:t xml:space="preserve">No. Solo las cuentas con rol admin ven la opción "Administración" y pueden crear, editar o eliminar temas, documentos y usuarios. El rol se asigna desde la pestaña "Gestión de Usuarios".</w:t>
-      </w:r>
-    </w:p>
-    <w:p>
+          <w:color w:val="14406F"/>
+        </w:rPr>
+        <w:t>2.</w:t>
+      </w:r>
+      <w:r>
+        <w:tab/>
+        <w:t xml:space="preserve">Capturar una pregunta real y, opcionalmente, las palabras clave que la respuesta debe contener, separadas por coma.</w:t>
+      </w:r>
+    </w:p>
+    <w:p>
+      <w:pPr>
+        <w:tabs>
+          <w:tab w:val="left" w:pos="460"/>
+        </w:tabs>
+        <w:spacing w:after="90" w:line="268" w:lineRule="auto"/>
+        <w:ind w:left="460" w:hanging="460"/>
+      </w:pPr>
       <w:r>
         <w:rPr>
           <w:b/>
           <w:bCs/>
-        </w:rPr>
-        <w:t xml:space="preserve">¿Qué diferencia hay entre las metodologías CRAFT, CREA y ASPECCT?</w:t>
-      </w:r>
-    </w:p>
-    <w:p>
-      <w:r>
-        <w:t xml:space="preserve">Son tres estructuras distintas de meta-prompting para organizar el System Prompt (contexto, rol, instrucciones, reglas y ejemplos, entre otras secciones). Cualquiera de las tres genera un prompt funcional; la elección depende de la preferencia del equipo.</w:t>
-      </w:r>
-    </w:p>
-    <w:p>
+          <w:color w:val="14406F"/>
+        </w:rPr>
+        <w:t>3.</w:t>
+      </w:r>
+      <w:r>
+        <w:tab/>
+        <w:t xml:space="preserve">Pulsar "Guardar Caso de Prueba". El caso queda listado para este tema.</w:t>
+      </w:r>
+    </w:p>
+    <w:p>
+      <w:pPr>
+        <w:tabs>
+          <w:tab w:val="left" w:pos="460"/>
+        </w:tabs>
+        <w:spacing w:after="90" w:line="268" w:lineRule="auto"/>
+        <w:ind w:left="460" w:hanging="460"/>
+      </w:pPr>
       <w:r>
         <w:rPr>
           <w:b/>
           <w:bCs/>
-        </w:rPr>
-        <w:t xml:space="preserve">¿El sandbox afecta las conversaciones reales de los usuarios finales?</w:t>
-      </w:r>
-    </w:p>
-    <w:p>
-      <w:r>
-        <w:t xml:space="preserve">No. El sandbox es un espacio de prueba aislado dentro del panel de administración.</w:t>
-      </w:r>
-    </w:p>
-    <w:p>
+          <w:color w:val="14406F"/>
+        </w:rPr>
+        <w:t>4.</w:t>
+      </w:r>
+      <w:r>
+        <w:tab/>
+        <w:t xml:space="preserve">Repetir para cada pregunta de referencia relevante del tema.</w:t>
+      </w:r>
+    </w:p>
+    <w:p>
+      <w:pPr>
+        <w:tabs>
+          <w:tab w:val="left" w:pos="460"/>
+        </w:tabs>
+        <w:spacing w:after="90" w:line="268" w:lineRule="auto"/>
+        <w:ind w:left="460" w:hanging="460"/>
+      </w:pPr>
       <w:r>
         <w:rPr>
           <w:b/>
           <w:bCs/>
-        </w:rPr>
-        <w:t xml:space="preserve">¿Qué pasa si elimino el tema equivocado?</w:t>
-      </w:r>
-    </w:p>
-    <w:p>
-      <w:r>
-        <w:t xml:space="preserve">La eliminación de un tema requiere confirmación explícita antes de ejecutarse, precisamente para evitar borrados accidentales. El tema general no puede eliminarse.</w:t>
-      </w:r>
-    </w:p>
-    <w:p>
+          <w:color w:val="14406F"/>
+        </w:rPr>
+        <w:t>5.</w:t>
+      </w:r>
+      <w:r>
+        <w:tab/>
+        <w:t xml:space="preserve">Pulsar "Ejecutar Suite" para correr todos los casos guardados contra el System Prompt vigente. El sistema muestra el porcentaje de casos aprobados y el detalle de cada respuesta.</w:t>
+      </w:r>
+    </w:p>
+    <w:p>
+      <w:pPr>
+        <w:spacing w:after="170"/>
+        <w:jc w:val="center"/>
+      </w:pPr>
       <w:r>
         <w:rPr>
           <w:b/>
           <w:bCs/>
+          <w:color w:val="14406F"/>
+          <w:sz w:val="19"/>
+          <w:szCs w:val="19"/>
+        </w:rPr>
+        <w:t xml:space="preserve">Figura 5. </w:t>
+      </w:r>
+      <w:r>
+        <w:rPr>
+          <w:i/>
+          <w:iCs/>
+          <w:color w:val="14406F"/>
+          <w:sz w:val="19"/>
+          <w:szCs w:val="19"/>
+        </w:rPr>
+        <w:t>Batería de regresión de prompts: casos guardados y resultado de la última ejecución</w:t>
+      </w:r>
+    </w:p>
+    <w:p>
+      <w:pPr>
+        <w:pStyle w:val="Ttulo3"/>
+      </w:pPr>
+      <w:bookmarkStart w:id="1025" w:name="_Toc_CS_025"/>
+      <w:r>
+        <w:t>4.14 Observabilidad del motor de IA</w:t>
+      </w:r>
+      <w:bookmarkEnd w:id="1025"/>
+    </w:p>
+    <w:p>
+      <w:pPr>
+        <w:tabs>
+          <w:tab w:val="left" w:pos="460"/>
+        </w:tabs>
+        <w:spacing w:after="90" w:line="268" w:lineRule="auto"/>
+        <w:ind w:left="460" w:hanging="460"/>
+      </w:pPr>
+      <w:r>
+        <w:rPr>
+          <w:b/>
+          <w:bCs/>
+          <w:color w:val="14406F"/>
+        </w:rPr>
+        <w:t>1.</w:t>
+      </w:r>
+      <w:r>
+        <w:tab/>
+        <w:t xml:space="preserve">Abrir la pestaña "Observabilidad" en la parte superior del panel.</w:t>
+      </w:r>
+    </w:p>
+    <w:p>
+      <w:pPr>
+        <w:tabs>
+          <w:tab w:val="left" w:pos="460"/>
+        </w:tabs>
+        <w:spacing w:after="90" w:line="268" w:lineRule="auto"/>
+        <w:ind w:left="460" w:hanging="460"/>
+      </w:pPr>
+      <w:r>
+        <w:rPr>
+          <w:b/>
+          <w:bCs/>
+          <w:color w:val="14406F"/>
+        </w:rPr>
+        <w:t>2.</w:t>
+      </w:r>
+      <w:r>
+        <w:tab/>
+        <w:t xml:space="preserve">Revisar las tarjetas de resumen: consultas procesadas, tasa de satisfacción de usuarios (según los votos "útil" / "no útil" registrados en el chat), temas configurados y estado de la caché.</w:t>
+      </w:r>
+    </w:p>
+    <w:p>
+      <w:pPr>
+        <w:tabs>
+          <w:tab w:val="left" w:pos="460"/>
+        </w:tabs>
+        <w:spacing w:after="90" w:line="268" w:lineRule="auto"/>
+        <w:ind w:left="460" w:hanging="460"/>
+      </w:pPr>
+      <w:r>
+        <w:rPr>
+          <w:b/>
+          <w:bCs/>
+          <w:color w:val="14406F"/>
+        </w:rPr>
+        <w:t>3.</w:t>
+      </w:r>
+      <w:r>
+        <w:tab/>
+        <w:t xml:space="preserve">Revisar la matriz de proveedores de IA para confirmar cuáles están activos y cuál es el orden de respaldo (fallback) configurado.</w:t>
+      </w:r>
+    </w:p>
+    <w:p>
+      <w:pPr>
+        <w:tabs>
+          <w:tab w:val="left" w:pos="460"/>
+        </w:tabs>
+        <w:spacing w:after="90" w:line="268" w:lineRule="auto"/>
+        <w:ind w:left="460" w:hanging="460"/>
+      </w:pPr>
+      <w:r>
+        <w:rPr>
+          <w:b/>
+          <w:bCs/>
+          <w:color w:val="14406F"/>
+        </w:rPr>
+        <w:t>4.</w:t>
+      </w:r>
+      <w:r>
+        <w:tab/>
+        <w:t xml:space="preserve">Pulsar el botón de actualizar para refrescar las métricas en cualquier momento.</w:t>
+      </w:r>
+    </w:p>
+    <w:p>
+      <w:pPr>
+        <w:spacing w:after="170"/>
+        <w:jc w:val="center"/>
+      </w:pPr>
+      <w:r>
+        <w:rPr>
+          <w:b/>
+          <w:bCs/>
+          <w:color w:val="14406F"/>
+          <w:sz w:val="19"/>
+          <w:szCs w:val="19"/>
+        </w:rPr>
+        <w:t xml:space="preserve">Figura 6. </w:t>
+      </w:r>
+      <w:r>
+        <w:rPr>
+          <w:i/>
+          <w:iCs/>
+          <w:color w:val="14406F"/>
+          <w:sz w:val="19"/>
+          <w:szCs w:val="19"/>
+        </w:rPr>
+        <w:t>Panel de Observabilidad: proveedores de IA, satisfacción de usuarios y estado de la caché</w:t>
+      </w:r>
+    </w:p>
+    <w:p>
+      <w:pPr>
+        <w:pStyle w:val="Ttulo1"/>
+      </w:pPr>
+      <w:bookmarkStart w:id="1026" w:name="_Toc_CS_026"/>
+      <w:r>
+        <w:t>5. Preguntas frecuentes</w:t>
+      </w:r>
+      <w:bookmarkEnd w:id="1026"/>
+    </w:p>
+    <w:p>
+      <w:r>
+        <w:rPr>
+          <w:b/>
+          <w:bCs/>
+        </w:rPr>
+        <w:t xml:space="preserve">¿Necesito una contraseña propia de ConsultaSmart?</w:t>
+      </w:r>
+    </w:p>
+    <w:p>
+      <w:r>
+        <w:t xml:space="preserve">No. El acceso es mediante inicio de sesión único (SSO) contra Authentik, con la cuenta institucional del usuario.</w:t>
+      </w:r>
+    </w:p>
+    <w:p>
+      <w:r>
+        <w:rPr>
+          <w:b/>
+          <w:bCs/>
+        </w:rPr>
+        <w:t xml:space="preserve">¿Cualquier usuario que inicie sesión puede administrar los chatbots?</w:t>
+      </w:r>
+    </w:p>
+    <w:p>
+      <w:r>
+        <w:t xml:space="preserve">No. Solo las cuentas con rol admin ven la opción "Administración" y pueden crear, editar o eliminar temas, documentos y usuarios. El rol se asigna desde la pestaña "Gestión de Usuarios".</w:t>
+      </w:r>
+    </w:p>
+    <w:p>
+      <w:r>
+        <w:rPr>
+          <w:b/>
+          <w:bCs/>
+        </w:rPr>
+        <w:t xml:space="preserve">¿Qué diferencia hay entre las metodologías CRAFT, CREA y ASPECCT?</w:t>
+      </w:r>
+    </w:p>
+    <w:p>
+      <w:r>
+        <w:t xml:space="preserve">Son tres estructuras distintas de meta-prompting para organizar el System Prompt (contexto, rol, instrucciones, reglas y ejemplos, entre otras secciones). Cualquiera de las tres genera un prompt funcional; la elección depende de la preferencia del equipo.</w:t>
+      </w:r>
+    </w:p>
+    <w:p>
+      <w:r>
+        <w:rPr>
+          <w:b/>
+          <w:bCs/>
+        </w:rPr>
+        <w:t xml:space="preserve">¿El sandbox afecta las conversaciones reales de los usuarios finales?</w:t>
+      </w:r>
+    </w:p>
+    <w:p>
+      <w:r>
+        <w:t xml:space="preserve">No. El sandbox es un espacio de prueba aislado dentro del panel de administración.</w:t>
+      </w:r>
+    </w:p>
+    <w:p>
+      <w:r>
+        <w:rPr>
+          <w:b/>
+          <w:bCs/>
+        </w:rPr>
+        <w:t xml:space="preserve">¿Qué pasa si elimino el tema equivocado?</w:t>
+      </w:r>
+    </w:p>
+    <w:p>
+      <w:r>
+        <w:t xml:space="preserve">La eliminación de un tema requiere confirmación explícita antes de ejecutarse, precisamente para evitar borrados accidentales. El tema general no puede eliminarse.</w:t>
+      </w:r>
+    </w:p>
+    <w:p>
+      <w:r>
+        <w:rPr>
+          <w:b/>
+          <w:bCs/>
         </w:rPr>
         <w:t xml:space="preserve">¿Qué implica otorgar el rol admin a otro usuario?</w:t>
       </w:r>
@@ -4233,14 +4867,42 @@
       </w:r>
     </w:p>
     <w:p>
+      <w:r>
+        <w:rPr>
+          <w:b/>
+          <w:bCs/>
+        </w:rPr>
+        <w:t xml:space="preserve">¿Es seguro capturar la clave de API de un proveedor de IA personalizado?</w:t>
+      </w:r>
+    </w:p>
+    <w:p>
+      <w:r>
+        <w:t xml:space="preserve">Sí. La clave se cifra antes de guardarse en la base de datos y el panel nunca la vuelve a mostrar en claro, solo sus últimos 4 caracteres para identificarla.</w:t>
+      </w:r>
+    </w:p>
+    <w:p>
+      <w:r>
+        <w:rPr>
+          <w:b/>
+          <w:bCs/>
+        </w:rPr>
+        <w:t xml:space="preserve">¿Para qué sirve la Batería de Regresión de Prompts?</w:t>
+      </w:r>
+    </w:p>
+    <w:p>
+      <w:r>
+        <w:t xml:space="preserve">Para confirmar, con preguntas reales guardadas de antemano, que un cambio al System Prompt o a los guardrails no dañó respuestas que antes eran correctas — se ejecuta con un clic después de cualquier ajuste importante.</w:t>
+      </w:r>
+    </w:p>
+    <w:p>
       <w:pPr>
         <w:pStyle w:val="Ttulo1"/>
       </w:pPr>
-      <w:bookmarkStart w:id="1025" w:name="_Toc_CS_025"/>
+      <w:bookmarkStart w:id="1027" w:name="_Toc_CS_027"/>
       <w:r>
         <w:t>6. Glosario de términos</w:t>
       </w:r>
-      <w:bookmarkEnd w:id="1025"/>
+      <w:bookmarkEnd w:id="1027"/>
     </w:p>
     <w:tbl>
       <w:tblPr>
@@ -4760,11 +5422,11 @@
       <w:pPr>
         <w:pStyle w:val="Ttulo1"/>
       </w:pPr>
-      <w:bookmarkStart w:id="1026" w:name="_Toc_CS_026"/>
+      <w:bookmarkStart w:id="1028" w:name="_Toc_CS_028"/>
       <w:r>
         <w:t>7. Aprobaciones</w:t>
       </w:r>
-      <w:bookmarkEnd w:id="1026"/>
+      <w:bookmarkEnd w:id="1028"/>
     </w:p>
     <w:tbl>
       <w:tblPr>
@@ -5093,11 +5755,11 @@
       <w:pPr>
         <w:pStyle w:val="Ttulo2"/>
       </w:pPr>
-      <w:bookmarkStart w:id="1027" w:name="_Toc_CS_027"/>
+      <w:bookmarkStart w:id="1029" w:name="_Toc_CS_029"/>
       <w:r>
         <w:t>Control de versiones</w:t>
       </w:r>
-      <w:bookmarkEnd w:id="1027"/>
+      <w:bookmarkEnd w:id="1029"/>
     </w:p>
     <w:tbl>
       <w:tblPr>
@@ -5325,6 +5987,100 @@
                 <w:szCs w:val="21"/>
               </w:rPr>
               <w:t xml:space="preserve">Elaboración inicial del manual de usuario del panel de administración de ConsultaSmart, reemplazando la versión previa que mezclaba contenido de arquitectura/auditoría técnica con el manual de usuario (ese contenido se trasladó a MANUAL_TECNICO_DESARROLLADOR.md), siguiendo el estándar de plantilla de CA-PGO-D-E-06.</w:t>
+            </w:r>
+          </w:p>
+        </w:tc>
+      </w:tr>
+      <w:tr>
+        <w:tc>
+          <w:tcPr>
+            <w:tcW w:w="1300" w:type="dxa"/>
+            <w:tcMar>
+              <w:top w:w="60" w:type="dxa"/>
+              <w:left w:w="120" w:type="dxa"/>
+              <w:bottom w:w="60" w:type="dxa"/>
+              <w:right w:w="120" w:type="dxa"/>
+            </w:tcMar>
+          </w:tcPr>
+          <w:p>
+            <w:pPr>
+              <w:spacing w:line="252" w:lineRule="auto"/>
+            </w:pPr>
+            <w:r>
+              <w:rPr>
+                <w:sz w:val="21"/>
+                <w:szCs w:val="21"/>
+              </w:rPr>
+              <w:t xml:space="preserve">1.1</w:t>
+            </w:r>
+          </w:p>
+        </w:tc>
+        <w:tc>
+          <w:tcPr>
+            <w:tcW w:w="1600" w:type="dxa"/>
+            <w:tcMar>
+              <w:top w:w="60" w:type="dxa"/>
+              <w:left w:w="120" w:type="dxa"/>
+              <w:bottom w:w="60" w:type="dxa"/>
+              <w:right w:w="120" w:type="dxa"/>
+            </w:tcMar>
+          </w:tcPr>
+          <w:p>
+            <w:pPr>
+              <w:spacing w:line="252" w:lineRule="auto"/>
+            </w:pPr>
+            <w:r>
+              <w:rPr>
+                <w:sz w:val="21"/>
+                <w:szCs w:val="21"/>
+              </w:rPr>
+              <w:t xml:space="preserve">22/07/2026</w:t>
+            </w:r>
+          </w:p>
+        </w:tc>
+        <w:tc>
+          <w:tcPr>
+            <w:tcW w:w="2800" w:type="dxa"/>
+            <w:tcMar>
+              <w:top w:w="60" w:type="dxa"/>
+              <w:left w:w="120" w:type="dxa"/>
+              <w:bottom w:w="60" w:type="dxa"/>
+              <w:right w:w="120" w:type="dxa"/>
+            </w:tcMar>
+          </w:tcPr>
+          <w:p>
+            <w:pPr>
+              <w:spacing w:line="252" w:lineRule="auto"/>
+            </w:pPr>
+            <w:r>
+              <w:rPr>
+                <w:sz w:val="21"/>
+                <w:szCs w:val="21"/>
+              </w:rPr>
+              <w:t xml:space="preserve">Israel Martínez Hernández (asistido por Claude)</w:t>
+            </w:r>
+          </w:p>
+        </w:tc>
+        <w:tc>
+          <w:tcPr>
+            <w:tcW w:w="3600" w:type="dxa"/>
+            <w:tcMar>
+              <w:top w:w="60" w:type="dxa"/>
+              <w:left w:w="120" w:type="dxa"/>
+              <w:bottom w:w="60" w:type="dxa"/>
+              <w:right w:w="120" w:type="dxa"/>
+            </w:tcMar>
+          </w:tcPr>
+          <w:p>
+            <w:pPr>
+              <w:spacing w:line="252" w:lineRule="auto"/>
+            </w:pPr>
+            <w:r>
+              <w:rPr>
+                <w:sz w:val="21"/>
+                <w:szCs w:val="21"/>
+              </w:rPr>
+              <w:t xml:space="preserve">Se documentan las funcionalidades de la segunda ronda de implementación: LLM personalizado por tema (con clave de API cifrada), Batería de Regresión de Prompts (4.13) y Observabilidad del motor de IA (4.14), además de un paso nuevo en Parámetros del tema (4.5) para configurar el proveedor de IA personalizado.</w:t>
             </w:r>
           </w:p>
         </w:tc>

</xml_diff>

<commit_message>
docs: implement CMMI standards, add React/FastAPI generation skills, and update technical documentation and Nginx configuration.
</commit_message>
<xml_diff>
--- a/CA-CS-M-01_Manual_de_usuario_ConsultaSmart_Admin.docx
+++ b/CA-CS-M-01_Manual_de_usuario_ConsultaSmart_Admin.docx
@@ -301,7 +301,7 @@
                 <w:sz w:val="21"/>
                 <w:szCs w:val="21"/>
               </w:rPr>
-              <w:t xml:space="preserve">1.1</w:t>
+              <w:t>1.4</w:t>
             </w:r>
           </w:p>
         </w:tc>
@@ -349,7 +349,7 @@
                 <w:sz w:val="21"/>
                 <w:szCs w:val="21"/>
               </w:rPr>
-              <w:t xml:space="preserve">22/07/2026</w:t>
+              <w:t>29/07/2026</w:t>
             </w:r>
           </w:p>
         </w:tc>
@@ -1282,6 +1282,38 @@
     </w:p>
     <w:p>
       <w:pPr>
+        <w:pStyle w:val="TDC3"/>
+        <w:tabs>
+          <w:tab w:val="right" w:leader="dot" w:pos="9350"/>
+        </w:tabs>
+        <w:rPr>
+          <w:noProof/>
+        </w:rPr>
+      </w:pPr>
+      <w:hyperlink w:anchor="_Toc_CS_026" w:history="1">
+        <w:r>
+          <w:rPr>
+            <w:rStyle w:val="Hipervnculo"/>
+            <w:noProof/>
+          </w:rPr>
+          <w:t>4.15 Historial de Cambios y Restauración de un Tema</w:t>
+        </w:r>
+        <w:r>
+          <w:rPr>
+            <w:noProof/>
+          </w:rPr>
+          <w:tab/>
+        </w:r>
+        <w:r>
+          <w:rPr>
+            <w:noProof/>
+          </w:rPr>
+          <w:t>6</w:t>
+        </w:r>
+      </w:hyperlink>
+    </w:p>
+    <w:p>
+      <w:pPr>
         <w:pStyle w:val="TDC1"/>
         <w:tabs>
           <w:tab w:val="right" w:leader="dot" w:pos="9350"/>
@@ -1290,7 +1322,7 @@
           <w:noProof/>
         </w:rPr>
       </w:pPr>
-      <w:hyperlink w:anchor="_Toc_CS_026" w:history="1">
+      <w:hyperlink w:anchor="_Toc_CS_027" w:history="1">
         <w:r>
           <w:rPr>
             <w:rStyle w:val="Hipervnculo"/>
@@ -1322,13 +1354,13 @@
           <w:noProof/>
         </w:rPr>
       </w:pPr>
-      <w:hyperlink w:anchor="_Toc_CS_027" w:history="1">
+      <w:hyperlink w:anchor="_Toc_CS_028" w:history="1">
         <w:r>
           <w:rPr>
             <w:rStyle w:val="Hipervnculo"/>
             <w:noProof/>
           </w:rPr>
-          <w:t>6. Glosario de términos</w:t>
+          <w:t>6. Cumplimiento de Estándares (CMMI)</w:t>
         </w:r>
         <w:r>
           <w:rPr>
@@ -1354,13 +1386,13 @@
           <w:noProof/>
         </w:rPr>
       </w:pPr>
-      <w:hyperlink w:anchor="_Toc_CS_028" w:history="1">
+      <w:hyperlink w:anchor="_Toc_CS_029" w:history="1">
         <w:r>
           <w:rPr>
             <w:rStyle w:val="Hipervnculo"/>
             <w:noProof/>
           </w:rPr>
-          <w:t>7. Aprobaciones</w:t>
+          <w:t>7. Glosario de términos</w:t>
         </w:r>
         <w:r>
           <w:rPr>
@@ -1373,6 +1405,38 @@
             <w:noProof/>
           </w:rPr>
           <w:t>8</w:t>
+        </w:r>
+      </w:hyperlink>
+    </w:p>
+    <w:p>
+      <w:pPr>
+        <w:pStyle w:val="TDC1"/>
+        <w:tabs>
+          <w:tab w:val="right" w:leader="dot" w:pos="9350"/>
+        </w:tabs>
+        <w:rPr>
+          <w:noProof/>
+        </w:rPr>
+      </w:pPr>
+      <w:hyperlink w:anchor="_Toc_CS_030" w:history="1">
+        <w:r>
+          <w:rPr>
+            <w:rStyle w:val="Hipervnculo"/>
+            <w:noProof/>
+          </w:rPr>
+          <w:t>8. Aprobaciones</w:t>
+        </w:r>
+        <w:r>
+          <w:rPr>
+            <w:noProof/>
+          </w:rPr>
+          <w:tab/>
+        </w:r>
+        <w:r>
+          <w:rPr>
+            <w:noProof/>
+          </w:rPr>
+          <w:t>9</w:t>
         </w:r>
       </w:hyperlink>
     </w:p>
@@ -2162,6 +2226,54 @@
                 <w:sz w:val="21"/>
                 <w:szCs w:val="21"/>
               </w:rPr>
+              <w:t xml:space="preserve">Historial de Cambios</w:t>
+            </w:r>
+          </w:p>
+        </w:tc>
+        <w:tc>
+          <w:tcPr>
+            <w:tcW w:w="6300" w:type="dxa"/>
+            <w:tcMar>
+              <w:top w:w="60" w:type="dxa"/>
+              <w:left w:w="120" w:type="dxa"/>
+              <w:bottom w:w="60" w:type="dxa"/>
+              <w:right w:w="120" w:type="dxa"/>
+            </w:tcMar>
+          </w:tcPr>
+          <w:p>
+            <w:pPr>
+              <w:spacing w:line="252" w:lineRule="auto"/>
+            </w:pPr>
+            <w:r>
+              <w:rPr>
+                <w:sz w:val="21"/>
+                <w:szCs w:val="21"/>
+              </w:rPr>
+              <w:t xml:space="preserve">Registro de quién editó, creó, eliminó o restauró un tema y cuándo, con la posibilidad de revertir a un punto anterior.</w:t>
+            </w:r>
+          </w:p>
+        </w:tc>
+      </w:tr>
+      <w:tr>
+        <w:tc>
+          <w:tcPr>
+            <w:tcW w:w="3000" w:type="dxa"/>
+            <w:tcMar>
+              <w:top w:w="60" w:type="dxa"/>
+              <w:left w:w="120" w:type="dxa"/>
+              <w:bottom w:w="60" w:type="dxa"/>
+              <w:right w:w="120" w:type="dxa"/>
+            </w:tcMar>
+          </w:tcPr>
+          <w:p>
+            <w:pPr>
+              <w:spacing w:line="252" w:lineRule="auto"/>
+            </w:pPr>
+            <w:r>
+              <w:rPr>
+                <w:sz w:val="21"/>
+                <w:szCs w:val="21"/>
+              </w:rPr>
               <w:t xml:space="preserve">Rol (admin / user)</w:t>
             </w:r>
           </w:p>
@@ -3093,7 +3205,7 @@
                 <w:sz w:val="21"/>
                 <w:szCs w:val="21"/>
               </w:rPr>
-              <w:t xml:space="preserve">Nivel y puntaje de estrictez, temperatura, temas prohibidos y mensaje de rechazo.</w:t>
+              <w:t>Nivel y puntaje de estrictez, temperatura, temas prohibidos y mensaje de rechazo; se ubica justo debajo del System Prompt generado y se envía también al generador para reforzarlo.</w:t>
             </w:r>
           </w:p>
         </w:tc>
@@ -3101,47 +3213,21 @@
       <w:tr>
         <w:tc>
           <w:tcPr>
-            <w:tcW w:w="3000" w:type="dxa"/>
-            <w:tcMar>
-              <w:top w:w="60" w:type="dxa"/>
-              <w:left w:w="120" w:type="dxa"/>
-              <w:bottom w:w="60" w:type="dxa"/>
-              <w:right w:w="120" w:type="dxa"/>
-            </w:tcMar>
-          </w:tcPr>
-          <w:p>
-            <w:pPr>
-              <w:spacing w:line="252" w:lineRule="auto"/>
-            </w:pPr>
-            <w:r>
-              <w:rPr>
-                <w:sz w:val="21"/>
-                <w:szCs w:val="21"/>
-              </w:rPr>
-              <w:t xml:space="preserve">Mensaje de bienvenida</w:t>
-            </w:r>
-          </w:p>
-        </w:tc>
-        <w:tc>
-          <w:tcPr>
-            <w:tcW w:w="6300" w:type="dxa"/>
-            <w:tcMar>
-              <w:top w:w="60" w:type="dxa"/>
-              <w:left w:w="120" w:type="dxa"/>
-              <w:bottom w:w="60" w:type="dxa"/>
-              <w:right w:w="120" w:type="dxa"/>
-            </w:tcMar>
-          </w:tcPr>
-          <w:p>
-            <w:pPr>
-              <w:spacing w:line="252" w:lineRule="auto"/>
-            </w:pPr>
-            <w:r>
-              <w:rPr>
-                <w:sz w:val="21"/>
-                <w:szCs w:val="21"/>
-              </w:rPr>
-              <w:t xml:space="preserve">Texto inicial que el chatbot muestra al usuario final al abrir la conversación.</w:t>
+            <w:tcW w:type="dxa" w:w="3000"/>
+          </w:tcPr>
+          <w:p>
+            <w:r>
+              <w:t>Motor de IA por tema</w:t>
+            </w:r>
+          </w:p>
+        </w:tc>
+        <w:tc>
+          <w:tcPr>
+            <w:tcW w:type="dxa" w:w="6300"/>
+          </w:tcPr>
+          <w:p>
+            <w:r>
+              <w:t>Selecciona el proveedor LLM (Groq, OpenAI, Anthropic, Mistral, Gemini, NVIDIA NIM u Ollama), su modelo — con catálogo cargado en vivo desde el proveedor — y, si aplica, el endpoint/Base URL y la clave de API cifrada.</w:t>
             </w:r>
           </w:p>
         </w:tc>
@@ -3166,7 +3252,7 @@
                 <w:sz w:val="21"/>
                 <w:szCs w:val="21"/>
               </w:rPr>
-              <w:t xml:space="preserve">Integración de widget</w:t>
+              <w:t xml:space="preserve">Mensaje de bienvenida</w:t>
             </w:r>
           </w:p>
         </w:tc>
@@ -3189,7 +3275,7 @@
                 <w:sz w:val="21"/>
                 <w:szCs w:val="21"/>
               </w:rPr>
-              <w:t xml:space="preserve">Genera y copia el snippet de embebido del chatbot para sitios externos.</w:t>
+              <w:t xml:space="preserve">Texto inicial que el chatbot muestra al usuario final al abrir la conversación.</w:t>
             </w:r>
           </w:p>
         </w:tc>
@@ -3214,7 +3300,7 @@
                 <w:sz w:val="21"/>
                 <w:szCs w:val="21"/>
               </w:rPr>
-              <w:t xml:space="preserve">Sandbox de prueba</w:t>
+              <w:t xml:space="preserve">Integración de widget</w:t>
             </w:r>
           </w:p>
         </w:tc>
@@ -3237,7 +3323,7 @@
                 <w:sz w:val="21"/>
                 <w:szCs w:val="21"/>
               </w:rPr>
-              <w:t xml:space="preserve">Permite conversar con el chatbot usando la configuración vigente en pantalla, antes o después de guardar.</w:t>
+              <w:t xml:space="preserve">Genera y copia el snippet de embebido del chatbot para sitios externos.</w:t>
             </w:r>
           </w:p>
         </w:tc>
@@ -3262,7 +3348,7 @@
                 <w:sz w:val="21"/>
                 <w:szCs w:val="21"/>
               </w:rPr>
-              <w:t xml:space="preserve">Guardar Configuración</w:t>
+              <w:t xml:space="preserve">Sandbox de prueba</w:t>
             </w:r>
           </w:p>
         </w:tc>
@@ -3285,7 +3371,7 @@
                 <w:sz w:val="21"/>
                 <w:szCs w:val="21"/>
               </w:rPr>
-              <w:t xml:space="preserve">Persiste los cambios del tema en la base de datos.</w:t>
+              <w:t xml:space="preserve">Permite conversar con el chatbot usando la configuración vigente en pantalla, antes o después de guardar.</w:t>
             </w:r>
           </w:p>
         </w:tc>
@@ -3310,7 +3396,7 @@
                 <w:sz w:val="21"/>
                 <w:szCs w:val="21"/>
               </w:rPr>
-              <w:t xml:space="preserve">Eliminar Tema</w:t>
+              <w:t xml:space="preserve">Guardar Configuración</w:t>
             </w:r>
           </w:p>
         </w:tc>
@@ -3333,7 +3419,7 @@
                 <w:sz w:val="21"/>
                 <w:szCs w:val="21"/>
               </w:rPr>
-              <w:t xml:space="preserve">Elimina un tema existente (no disponible para el tema general).</w:t>
+              <w:t xml:space="preserve">Persiste los cambios del tema en la base de datos.</w:t>
             </w:r>
           </w:p>
         </w:tc>
@@ -3358,7 +3444,7 @@
                 <w:sz w:val="21"/>
                 <w:szCs w:val="21"/>
               </w:rPr>
-              <w:t xml:space="preserve">Gestión de Usuarios y Roles</w:t>
+              <w:t xml:space="preserve">Eliminar Tema</w:t>
             </w:r>
           </w:p>
         </w:tc>
@@ -3381,7 +3467,7 @@
                 <w:sz w:val="21"/>
                 <w:szCs w:val="21"/>
               </w:rPr>
-              <w:t xml:space="preserve">Lista los usuarios registrados y permite otorgar o revocar el rol admin.</w:t>
+              <w:t xml:space="preserve">Elimina un tema existente (no disponible para el tema general).</w:t>
             </w:r>
           </w:p>
         </w:tc>
@@ -3406,7 +3492,7 @@
                 <w:sz w:val="21"/>
                 <w:szCs w:val="21"/>
               </w:rPr>
-              <w:t xml:space="preserve">Batería de Regresión de Prompts</w:t>
+              <w:t xml:space="preserve">Gestión de Usuarios y Roles</w:t>
             </w:r>
           </w:p>
         </w:tc>
@@ -3429,7 +3515,7 @@
                 <w:sz w:val="21"/>
                 <w:szCs w:val="21"/>
               </w:rPr>
-              <w:t xml:space="preserve">Guarda preguntas de referencia por tema y ejecuta la suite completa para detectar si un cambio de prompt rompió respuestas antes correctas.</w:t>
+              <w:t xml:space="preserve">Lista los usuarios registrados y permite otorgar o revocar el rol admin.</w:t>
             </w:r>
           </w:p>
         </w:tc>
@@ -3454,6 +3540,54 @@
                 <w:sz w:val="21"/>
                 <w:szCs w:val="21"/>
               </w:rPr>
+              <w:t xml:space="preserve">Batería de Regresión de Prompts</w:t>
+            </w:r>
+          </w:p>
+        </w:tc>
+        <w:tc>
+          <w:tcPr>
+            <w:tcW w:w="6300" w:type="dxa"/>
+            <w:tcMar>
+              <w:top w:w="60" w:type="dxa"/>
+              <w:left w:w="120" w:type="dxa"/>
+              <w:bottom w:w="60" w:type="dxa"/>
+              <w:right w:w="120" w:type="dxa"/>
+            </w:tcMar>
+          </w:tcPr>
+          <w:p>
+            <w:pPr>
+              <w:spacing w:line="252" w:lineRule="auto"/>
+            </w:pPr>
+            <w:r>
+              <w:rPr>
+                <w:sz w:val="21"/>
+                <w:szCs w:val="21"/>
+              </w:rPr>
+              <w:t xml:space="preserve">Guarda preguntas de referencia por tema y ejecuta la suite completa para detectar si un cambio de prompt rompió respuestas antes correctas.</w:t>
+            </w:r>
+          </w:p>
+        </w:tc>
+      </w:tr>
+      <w:tr>
+        <w:tc>
+          <w:tcPr>
+            <w:tcW w:w="3000" w:type="dxa"/>
+            <w:tcMar>
+              <w:top w:w="60" w:type="dxa"/>
+              <w:left w:w="120" w:type="dxa"/>
+              <w:bottom w:w="60" w:type="dxa"/>
+              <w:right w:w="120" w:type="dxa"/>
+            </w:tcMar>
+          </w:tcPr>
+          <w:p>
+            <w:pPr>
+              <w:spacing w:line="252" w:lineRule="auto"/>
+            </w:pPr>
+            <w:r>
+              <w:rPr>
+                <w:sz w:val="21"/>
+                <w:szCs w:val="21"/>
+              </w:rPr>
               <w:t xml:space="preserve">Observabilidad</w:t>
             </w:r>
           </w:p>
@@ -3478,6 +3612,54 @@
                 <w:szCs w:val="21"/>
               </w:rPr>
               <w:t xml:space="preserve">Pestaña con métricas del enrutador de IA: proveedores activos, satisfacción de usuarios y estado de la caché.</w:t>
+            </w:r>
+          </w:p>
+        </w:tc>
+      </w:tr>
+      <w:tr>
+        <w:tc>
+          <w:tcPr>
+            <w:tcW w:w="3000" w:type="dxa"/>
+            <w:tcMar>
+              <w:top w:w="60" w:type="dxa"/>
+              <w:left w:w="120" w:type="dxa"/>
+              <w:bottom w:w="60" w:type="dxa"/>
+              <w:right w:w="120" w:type="dxa"/>
+            </w:tcMar>
+          </w:tcPr>
+          <w:p>
+            <w:pPr>
+              <w:spacing w:line="252" w:lineRule="auto"/>
+            </w:pPr>
+            <w:r>
+              <w:rPr>
+                <w:sz w:val="21"/>
+                <w:szCs w:val="21"/>
+              </w:rPr>
+              <w:t xml:space="preserve">Historial de Cambios</w:t>
+            </w:r>
+          </w:p>
+        </w:tc>
+        <w:tc>
+          <w:tcPr>
+            <w:tcW w:w="6300" w:type="dxa"/>
+            <w:tcMar>
+              <w:top w:w="60" w:type="dxa"/>
+              <w:left w:w="120" w:type="dxa"/>
+              <w:bottom w:w="60" w:type="dxa"/>
+              <w:right w:w="120" w:type="dxa"/>
+            </w:tcMar>
+          </w:tcPr>
+          <w:p>
+            <w:pPr>
+              <w:spacing w:line="252" w:lineRule="auto"/>
+            </w:pPr>
+            <w:r>
+              <w:rPr>
+                <w:sz w:val="21"/>
+                <w:szCs w:val="21"/>
+              </w:rPr>
+              <w:t xml:space="preserve">Bitácora del tema activo con restauración a un clic a cualquier punto anterior.</w:t>
             </w:r>
           </w:p>
         </w:tc>
@@ -3814,6 +3996,22 @@
     </w:p>
     <w:p>
       <w:pPr>
+        <w:ind w:left="460" w:hanging="460"/>
+      </w:pPr>
+      <w:r>
+        <w:rPr>
+          <w:b/>
+        </w:rPr>
+        <w:t>6.</w:t>
+      </w:r>
+      <w:r>
+        <w:rPr/>
+        <w:tab/>
+        <w:t>Los Tópicos Prohibidos y el Mensaje de Rechazo ya configurados en Guardrails (ver 4.6) se envían automáticamente al generador, para que el System Prompt resultante los incluya de forma explícita en vez de inventarlos.</w:t>
+      </w:r>
+    </w:p>
+    <w:p>
+      <w:pPr>
         <w:pStyle w:val="Ttulo3"/>
       </w:pPr>
       <w:bookmarkStart w:id="1016" w:name="_Toc_CS_016"/>
@@ -3924,7 +4122,55 @@
       </w:r>
       <w:r>
         <w:tab/>
-        <w:t xml:space="preserve">Opcionalmente, en Proveedor de IA seleccionar un motor distinto al global (por ejemplo, una cuenta propia) y capturar su clave de API y, si aplica, el modelo específico.</w:t>
+        <w:t>Opcionalmente, en Proveedor de IA seleccionar un motor distinto al global: Groq, OpenAI, Anthropic, Mistral, Google AI Studio (Gemini), NVIDIA NIM u Ollama. Vertex AI no está disponible como motor por tema — solo puede configurarse una vez, de forma global, en el servidor.</w:t>
+      </w:r>
+    </w:p>
+    <w:p>
+      <w:pPr>
+        <w:ind w:left="460" w:hanging="460"/>
+      </w:pPr>
+      <w:r>
+        <w:rPr>
+          <w:b/>
+        </w:rPr>
+        <w:t>6.</w:t>
+      </w:r>
+      <w:r>
+        <w:rPr/>
+        <w:tab/>
+        <w:t>Si el proveedor elegido es Ollama, capturar el Endpoint / Base URL del servidor (por ejemplo http://ollama-host:11434); es obligatorio porque Ollama no tiene una dirección pública única. Para OpenAI, NVIDIA NIM o Mistral este campo es opcional y solo aplica si se usa un proxy o gateway propio.</w:t>
+      </w:r>
+    </w:p>
+    <w:p>
+      <w:pPr>
+        <w:ind w:left="460" w:hanging="460"/>
+      </w:pPr>
+      <w:r>
+        <w:rPr>
+          <w:b/>
+        </w:rPr>
+        <w:t>7.</w:t>
+      </w:r>
+      <w:r>
+        <w:rPr/>
+        <w:tab/>
+        <w:t>Capturar la clave de API del proveedor elegido (no aplica a Ollama, que no requiere clave).</w:t>
+      </w:r>
+    </w:p>
+    <w:p>
+      <w:pPr>
+        <w:ind w:left="460" w:hanging="460"/>
+      </w:pPr>
+      <w:r>
+        <w:rPr>
+          <w:b/>
+        </w:rPr>
+        <w:t>8.</w:t>
+      </w:r>
+      <w:r>
+        <w:rPr/>
+        <w:tab/>
+        <w:t>Pulsar “Cargar modelos disponibles” para consultar en vivo el catálogo real de modelos del proveedor (usando la clave y/o el endpoint ya capturados) y elegir el modelo de la lista, o escribirlo manualmente si se conoce su identificador exacto.</w:t>
       </w:r>
     </w:p>
     <w:p>
@@ -3936,6 +4182,12 @@
         <w:t>4.6 Guardrails y control de alucinaciones</w:t>
       </w:r>
       <w:bookmarkEnd w:id="1017"/>
+    </w:p>
+    <w:p>
+      <w:pPr/>
+      <w:r>
+        <w:t>Esta sección aparece en pantalla inmediatamente debajo del System Prompt generado (no al final del formulario): los Temas Prohibidos capturados aquí se bloquean localmente por coincidencia de texto antes de invocar al modelo, y ese mismo listado se envía también al generador de prompts (4.4) para quedar reflejado como instrucción dentro del propio System Prompt.</w:t>
+      </w:r>
     </w:p>
     <w:p>
       <w:pPr>
@@ -4019,6 +4271,22 @@
       <w:r>
         <w:tab/>
         <w:t xml:space="preserve">Redactar el Mensaje de rechazo que el chatbot mostrará ante una consulta fuera de dominio.</w:t>
+      </w:r>
+    </w:p>
+    <w:p>
+      <w:pPr>
+        <w:ind w:left="460" w:hanging="460"/>
+      </w:pPr>
+      <w:r>
+        <w:rPr>
+          <w:b/>
+        </w:rPr>
+        <w:t>5.</w:t>
+      </w:r>
+      <w:r>
+        <w:rPr/>
+        <w:tab/>
+        <w:t>Si el tema no trae Temas Prohibidos propios, el sistema propone por defecto: deportes, futbol, cine, cocina, politica, chismes, entretenimiento, demandas legales, cultura general, tesis academicas, redaccion de documentos legales, asesoria juridica personal — conviene revisarlos y ajustarlos al dominio real del tema antes de guardar.</w:t>
       </w:r>
     </w:p>
     <w:p>
@@ -4774,83 +5042,138 @@
     </w:p>
     <w:p>
       <w:pPr>
-        <w:pStyle w:val="Ttulo1"/>
+        <w:pStyle w:val="Ttulo3"/>
       </w:pPr>
       <w:bookmarkStart w:id="1026" w:name="_Toc_CS_026"/>
       <w:r>
-        <w:t>5. Preguntas frecuentes</w:t>
+        <w:t>4.15 Historial de Cambios y Restauración de un Tema</w:t>
       </w:r>
       <w:bookmarkEnd w:id="1026"/>
     </w:p>
     <w:p>
+      <w:r>
+        <w:t xml:space="preserve">Cada tema lleva un historial de cambios: quién editó qué y cuándo, con la posibilidad de revertir la configuración a cualquier punto anterior con un clic.</w:t>
+      </w:r>
+    </w:p>
+    <w:p>
+      <w:pPr>
+        <w:tabs>
+          <w:tab w:val="left" w:pos="460"/>
+        </w:tabs>
+        <w:spacing w:after="90" w:line="268" w:lineRule="auto"/>
+        <w:ind w:left="460" w:hanging="460"/>
+      </w:pPr>
       <w:r>
         <w:rPr>
           <w:b/>
           <w:bCs/>
-        </w:rPr>
-        <w:t xml:space="preserve">¿Necesito una contraseña propia de ConsultaSmart?</w:t>
-      </w:r>
-    </w:p>
-    <w:p>
-      <w:r>
-        <w:t xml:space="preserve">No. El acceso es mediante inicio de sesión único (SSO) contra Authentik, con la cuenta institucional del usuario.</w:t>
-      </w:r>
-    </w:p>
-    <w:p>
+          <w:color w:val="14406F"/>
+        </w:rPr>
+        <w:t>1.</w:t>
+      </w:r>
+      <w:r>
+        <w:tab/>
+        <w:t xml:space="preserve">Debajo del panel de configuración del tema activo, ubicar la sección "Historial de Cambios".</w:t>
+      </w:r>
+    </w:p>
+    <w:p>
+      <w:pPr>
+        <w:tabs>
+          <w:tab w:val="left" w:pos="460"/>
+        </w:tabs>
+        <w:spacing w:after="90" w:line="268" w:lineRule="auto"/>
+        <w:ind w:left="460" w:hanging="460"/>
+      </w:pPr>
       <w:r>
         <w:rPr>
           <w:b/>
           <w:bCs/>
-        </w:rPr>
-        <w:t xml:space="preserve">¿Cualquier usuario que inicie sesión puede administrar los chatbots?</w:t>
-      </w:r>
-    </w:p>
-    <w:p>
-      <w:r>
-        <w:t xml:space="preserve">No. Solo las cuentas con rol admin ven la opción "Administración" y pueden crear, editar o eliminar temas, documentos y usuarios. El rol se asigna desde la pestaña "Gestión de Usuarios".</w:t>
-      </w:r>
-    </w:p>
-    <w:p>
+          <w:color w:val="14406F"/>
+        </w:rPr>
+        <w:t>2.</w:t>
+      </w:r>
+      <w:r>
+        <w:tab/>
+        <w:t xml:space="preserve">Revisar la lista: cada entrada muestra el tipo de cambio (creación, edición, eliminación o restauración), quién lo hizo y cuándo.</w:t>
+      </w:r>
+    </w:p>
+    <w:p>
+      <w:pPr>
+        <w:tabs>
+          <w:tab w:val="left" w:pos="460"/>
+        </w:tabs>
+        <w:spacing w:after="90" w:line="268" w:lineRule="auto"/>
+        <w:ind w:left="460" w:hanging="460"/>
+      </w:pPr>
       <w:r>
         <w:rPr>
           <w:b/>
           <w:bCs/>
-        </w:rPr>
-        <w:t xml:space="preserve">¿Qué diferencia hay entre las metodologías CRAFT, CREA y ASPECCT?</w:t>
-      </w:r>
-    </w:p>
-    <w:p>
-      <w:r>
-        <w:t xml:space="preserve">Son tres estructuras distintas de meta-prompting para organizar el System Prompt (contexto, rol, instrucciones, reglas y ejemplos, entre otras secciones). Cualquiera de las tres genera un prompt funcional; la elección depende de la preferencia del equipo.</w:t>
-      </w:r>
-    </w:p>
-    <w:p>
+          <w:color w:val="14406F"/>
+        </w:rPr>
+        <w:t>3.</w:t>
+      </w:r>
+      <w:r>
+        <w:tab/>
+        <w:t xml:space="preserve">Para revertir el tema a un estado anterior, pulsar "Restaurar" en la entrada correspondiente y confirmar en el cuadro de diálogo.</w:t>
+      </w:r>
+    </w:p>
+    <w:p>
+      <w:pPr>
+        <w:tabs>
+          <w:tab w:val="left" w:pos="460"/>
+        </w:tabs>
+        <w:spacing w:after="90" w:line="268" w:lineRule="auto"/>
+        <w:ind w:left="460" w:hanging="460"/>
+      </w:pPr>
       <w:r>
         <w:rPr>
           <w:b/>
           <w:bCs/>
-        </w:rPr>
-        <w:t xml:space="preserve">¿El sandbox afecta las conversaciones reales de los usuarios finales?</w:t>
-      </w:r>
-    </w:p>
-    <w:p>
-      <w:r>
-        <w:t xml:space="preserve">No. El sandbox es un espacio de prueba aislado dentro del panel de administración.</w:t>
-      </w:r>
-    </w:p>
-    <w:p>
+          <w:color w:val="14406F"/>
+        </w:rPr>
+        <w:t>4.</w:t>
+      </w:r>
+      <w:r>
+        <w:tab/>
+        <w:t xml:space="preserve">El sistema aplica la configuración de esa entrada y agrega un nuevo registro de tipo "Restauración" al historial — el historial nunca se borra ni se sobreescribe, solo crece.</w:t>
+      </w:r>
+    </w:p>
+    <w:p>
+      <w:pPr>
+        <w:spacing w:after="170"/>
+        <w:jc w:val="center"/>
+      </w:pPr>
       <w:r>
         <w:rPr>
           <w:b/>
           <w:bCs/>
-        </w:rPr>
-        <w:t xml:space="preserve">¿Qué pasa si elimino el tema equivocado?</w:t>
-      </w:r>
-    </w:p>
-    <w:p>
-      <w:r>
-        <w:t xml:space="preserve">La eliminación de un tema requiere confirmación explícita antes de ejecutarse, precisamente para evitar borrados accidentales. El tema general no puede eliminarse.</w:t>
-      </w:r>
+          <w:color w:val="14406F"/>
+          <w:sz w:val="19"/>
+          <w:szCs w:val="19"/>
+        </w:rPr>
+        <w:t xml:space="preserve">Figura 7. </w:t>
+      </w:r>
+      <w:r>
+        <w:rPr>
+          <w:i/>
+          <w:iCs/>
+          <w:color w:val="14406F"/>
+          <w:sz w:val="19"/>
+          <w:szCs w:val="19"/>
+        </w:rPr>
+        <w:t>Historial de Cambios de un tema, con botón Restaurar por entrada</w:t>
+      </w:r>
+    </w:p>
+    <w:p>
+      <w:pPr>
+        <w:pStyle w:val="Ttulo1"/>
+      </w:pPr>
+      <w:bookmarkStart w:id="1027" w:name="_Toc_CS_027"/>
+      <w:r>
+        <w:t>5. Preguntas frecuentes</w:t>
+      </w:r>
+      <w:bookmarkEnd w:id="1027"/>
     </w:p>
     <w:p>
       <w:r>
@@ -4858,12 +5181,12 @@
           <w:b/>
           <w:bCs/>
         </w:rPr>
-        <w:t xml:space="preserve">¿Qué implica otorgar el rol admin a otro usuario?</w:t>
-      </w:r>
-    </w:p>
-    <w:p>
-      <w:r>
-        <w:t xml:space="preserve">Esa cuenta podrá crear, editar y eliminar cualquier tema de chatbot, documento y usuario del sistema — por eso el panel solicita confirmación explícita antes de aplicar el cambio.</w:t>
+        <w:t xml:space="preserve">¿Necesito una contraseña propia de ConsultaSmart?</w:t>
+      </w:r>
+    </w:p>
+    <w:p>
+      <w:r>
+        <w:t xml:space="preserve">No. El acceso es mediante inicio de sesión único (SSO) contra Authentik, con la cuenta institucional del usuario.</w:t>
       </w:r>
     </w:p>
     <w:p>
@@ -4872,12 +5195,12 @@
           <w:b/>
           <w:bCs/>
         </w:rPr>
-        <w:t xml:space="preserve">¿Es seguro capturar la clave de API de un proveedor de IA personalizado?</w:t>
-      </w:r>
-    </w:p>
-    <w:p>
-      <w:r>
-        <w:t xml:space="preserve">Sí. La clave se cifra antes de guardarse en la base de datos y el panel nunca la vuelve a mostrar en claro, solo sus últimos 4 caracteres para identificarla.</w:t>
+        <w:t xml:space="preserve">¿Cualquier usuario que inicie sesión puede administrar los chatbots?</w:t>
+      </w:r>
+    </w:p>
+    <w:p>
+      <w:r>
+        <w:t xml:space="preserve">No. Solo las cuentas con rol admin ven la opción "Administración" y pueden crear, editar o eliminar temas, documentos y usuarios. El rol se asigna desde la pestaña "Gestión de Usuarios".</w:t>
       </w:r>
     </w:p>
     <w:p>
@@ -4886,6 +5209,76 @@
           <w:b/>
           <w:bCs/>
         </w:rPr>
+        <w:t xml:space="preserve">¿Qué diferencia hay entre las metodologías CRAFT, CREA y ASPECCT?</w:t>
+      </w:r>
+    </w:p>
+    <w:p>
+      <w:r>
+        <w:t xml:space="preserve">Son tres estructuras distintas de meta-prompting para organizar el System Prompt (contexto, rol, instrucciones, reglas y ejemplos, entre otras secciones). Cualquiera de las tres genera un prompt funcional; la elección depende de la preferencia del equipo.</w:t>
+      </w:r>
+    </w:p>
+    <w:p>
+      <w:r>
+        <w:rPr>
+          <w:b/>
+          <w:bCs/>
+        </w:rPr>
+        <w:t xml:space="preserve">¿El sandbox afecta las conversaciones reales de los usuarios finales?</w:t>
+      </w:r>
+    </w:p>
+    <w:p>
+      <w:r>
+        <w:t xml:space="preserve">No. El sandbox es un espacio de prueba aislado dentro del panel de administración.</w:t>
+      </w:r>
+    </w:p>
+    <w:p>
+      <w:r>
+        <w:rPr>
+          <w:b/>
+          <w:bCs/>
+        </w:rPr>
+        <w:t xml:space="preserve">¿Qué pasa si elimino el tema equivocado?</w:t>
+      </w:r>
+    </w:p>
+    <w:p>
+      <w:r>
+        <w:t xml:space="preserve">La eliminación de un tema requiere confirmación explícita antes de ejecutarse, precisamente para evitar borrados accidentales. El tema general no puede eliminarse.</w:t>
+      </w:r>
+    </w:p>
+    <w:p>
+      <w:r>
+        <w:rPr>
+          <w:b/>
+          <w:bCs/>
+        </w:rPr>
+        <w:t xml:space="preserve">¿Qué implica otorgar el rol admin a otro usuario?</w:t>
+      </w:r>
+    </w:p>
+    <w:p>
+      <w:r>
+        <w:t xml:space="preserve">Esa cuenta podrá crear, editar y eliminar cualquier tema de chatbot, documento y usuario del sistema — por eso el panel solicita confirmación explícita antes de aplicar el cambio.</w:t>
+      </w:r>
+    </w:p>
+    <w:p>
+      <w:r>
+        <w:rPr>
+          <w:b/>
+          <w:bCs/>
+        </w:rPr>
+        <w:t xml:space="preserve">¿Es seguro capturar la clave de API de un proveedor de IA personalizado?</w:t>
+      </w:r>
+    </w:p>
+    <w:p>
+      <w:r>
+        <w:t xml:space="preserve">Sí. La clave se cifra antes de guardarse en la base de datos y el panel nunca la vuelve a mostrar en claro, solo sus últimos 4 caracteres para identificarla.</w:t>
+      </w:r>
+    </w:p>
+    <w:p>
+      <w:r>
+        <w:rPr>
+          <w:b/>
+          <w:bCs/>
+        </w:rPr>
         <w:t xml:space="preserve">¿Para qué sirve la Batería de Regresión de Prompts?</w:t>
       </w:r>
     </w:p>
@@ -4895,14 +5288,59 @@
       </w:r>
     </w:p>
     <w:p>
+      <w:r>
+        <w:rPr>
+          <w:b/>
+          <w:bCs/>
+        </w:rPr>
+        <w:t xml:space="preserve">¿Qué pasa si edito un tema por error y quiero recuperar la versión anterior?</w:t>
+      </w:r>
+    </w:p>
+    <w:p>
+      <w:r>
+        <w:t xml:space="preserve">Abrir el Historial de Cambios del tema y pulsar "Restaurar" en la entrada del punto al que se desea volver. No es necesario recordar la configuración anterior de memoria.</w:t>
+      </w:r>
+    </w:p>
+    <w:p>
+      <w:pPr/>
+      <w:r>
+        <w:t>¿Qué pasa si dos administradores editan el mismo tema al mismo tiempo?</w:t>
+      </w:r>
+    </w:p>
+    <w:p>
+      <w:pPr/>
+      <w:r>
+        <w:t>El sistema detecta el conflicto: si al guardar alguien más ya guardó cambios sobre ese tema mientras tú lo tenías abierto, se muestra un aviso en vez de sobreescribir en silencio. Vuelve a seleccionar el tema para cargar la versión más reciente antes de guardar de nuevo.</w:t>
+      </w:r>
+    </w:p>
+    <w:p>
+      <w:r>
+        <w:rPr>
+          <w:b/>
+          <w:bCs/>
+        </w:rPr>
+        <w:t xml:space="preserve">¿Puedo editar el tema "general" directamente?</w:t>
+      </w:r>
+    </w:p>
+    <w:p>
+      <w:r>
+        <w:t xml:space="preserve">No. El tema "general" es de solo lectura; el panel redirige automáticamente a "Guardar como tema nuevo" si se intenta guardar sobre él.</w:t>
+      </w:r>
+    </w:p>
+    <w:p>
       <w:pPr>
         <w:pStyle w:val="Ttulo1"/>
       </w:pPr>
-      <w:bookmarkStart w:id="1027" w:name="_Toc_CS_027"/>
-      <w:r>
-        <w:t>6. Glosario de términos</w:t>
-      </w:r>
-      <w:bookmarkEnd w:id="1027"/>
+      <w:bookmarkStart w:id="1028" w:name="_Toc_CS_028"/>
+      <w:r>
+        <w:t>6. Cumplimiento de Estándares (CMMI)</w:t>
+      </w:r>
+      <w:bookmarkEnd w:id="1028"/>
+    </w:p>
+    <w:p>
+      <w:r>
+        <w:t xml:space="preserve">ConsultaSmart sigue prácticas del modelo CMMI (Capability Maturity Model Integration) aplicadas de forma práctica a este sistema, no solo como documento aspiracional. La siguiente tabla resume qué práctica cubre cada funcionalidad visible del panel — el detalle completo para el equipo técnico vive en docs/ESTANDAR_CMMI_UNIVERSAL.md y MANUAL_TECNICO_DESARROLLADOR.md.</w:t>
+      </w:r>
     </w:p>
     <w:tbl>
       <w:tblPr>
@@ -4952,7 +5390,7 @@
                 <w:sz w:val="21"/>
                 <w:szCs w:val="21"/>
               </w:rPr>
-              <w:t xml:space="preserve">Término</w:t>
+              <w:t xml:space="preserve">Práctica CMMI</w:t>
             </w:r>
           </w:p>
         </w:tc>
@@ -4979,7 +5417,7 @@
                 <w:sz w:val="21"/>
                 <w:szCs w:val="21"/>
               </w:rPr>
-              <w:t xml:space="preserve">Definición</w:t>
+              <w:t xml:space="preserve">Qué significa para el administrador</w:t>
             </w:r>
           </w:p>
         </w:tc>
@@ -5004,7 +5442,7 @@
                 <w:sz w:val="21"/>
                 <w:szCs w:val="21"/>
               </w:rPr>
-              <w:t xml:space="preserve">Authentik</w:t>
+              <w:t xml:space="preserve">Gestión de Configuración (CM)</w:t>
             </w:r>
           </w:p>
         </w:tc>
@@ -5027,7 +5465,7 @@
                 <w:sz w:val="21"/>
                 <w:szCs w:val="21"/>
               </w:rPr>
-              <w:t xml:space="preserve">Plataforma de gestión de identidad y acceso (SSO) que administra la autenticación de los usuarios en CASMARTS.</w:t>
+              <w:t xml:space="preserve">Todo cambio a un tema queda registrado (Historial de Cambios, sección 4.15) y puede revertirse a un clic — ningún cambio es "definitivo e irreversible" salvo la eliminación de un tema, que sí pide confirmación explícita.</w:t>
             </w:r>
           </w:p>
         </w:tc>
@@ -5052,7 +5490,7 @@
                 <w:sz w:val="21"/>
                 <w:szCs w:val="21"/>
               </w:rPr>
-              <w:t xml:space="preserve">Tema / Perfil de chatbot</w:t>
+              <w:t xml:space="preserve">Análisis Causal y Resolución (CAR)</w:t>
             </w:r>
           </w:p>
         </w:tc>
@@ -5075,7 +5513,7 @@
                 <w:sz w:val="21"/>
                 <w:szCs w:val="21"/>
               </w:rPr>
-              <w:t xml:space="preserve">Registro de configuración de un chatbot (System Prompt, guardrails, apariencia).</w:t>
+              <w:t xml:space="preserve">Cuando algo falla, se documenta la causa raíz y la corrección (no solo "se arregló") en una bitácora técnica, para prevenir que el mismo problema se repita.</w:t>
             </w:r>
           </w:p>
         </w:tc>
@@ -5100,7 +5538,7 @@
                 <w:sz w:val="21"/>
                 <w:szCs w:val="21"/>
               </w:rPr>
-              <w:t xml:space="preserve">System Prompt</w:t>
+              <w:t xml:space="preserve">Gestión de Riesgos (RSKM)</w:t>
             </w:r>
           </w:p>
         </w:tc>
@@ -5123,7 +5561,7 @@
                 <w:sz w:val="21"/>
                 <w:szCs w:val="21"/>
               </w:rPr>
-              <w:t xml:space="preserve">Instrucción maestra que rige el comportamiento del chatbot.</w:t>
+              <w:t xml:space="preserve">Los riesgos conocidos del sistema (por ejemplo, aspectos de seguridad aún pendientes de cerrar) están documentados explícitamente con su plan de cierre, no ocultos ni olvidados.</w:t>
             </w:r>
           </w:p>
         </w:tc>
@@ -5148,7 +5586,7 @@
                 <w:sz w:val="21"/>
                 <w:szCs w:val="21"/>
               </w:rPr>
-              <w:t xml:space="preserve">CRAFT / CREA / ASPECCT</w:t>
+              <w:t xml:space="preserve">Aseguramiento de Calidad (PPQA)</w:t>
             </w:r>
           </w:p>
         </w:tc>
@@ -5171,7 +5609,7 @@
                 <w:sz w:val="21"/>
                 <w:szCs w:val="21"/>
               </w:rPr>
-              <w:t xml:space="preserve">Metodologías de meta-prompting para estructurar el System Prompt.</w:t>
+              <w:t xml:space="preserve">El sistema pasa por revisiones de seguridad y funcionalidad independientes, con hallazgos verificados contra el sistema real antes de declararse corregidos.</w:t>
             </w:r>
           </w:p>
         </w:tc>
@@ -5196,7 +5634,7 @@
                 <w:sz w:val="21"/>
                 <w:szCs w:val="21"/>
               </w:rPr>
-              <w:t xml:space="preserve">Guardrail</w:t>
+              <w:t xml:space="preserve">Medición y Análisis (MA)</w:t>
             </w:r>
           </w:p>
         </w:tc>
@@ -5219,199 +5657,7 @@
                 <w:sz w:val="21"/>
                 <w:szCs w:val="21"/>
               </w:rPr>
-              <w:t xml:space="preserve">Control que delimita el dominio de respuesta del chatbot (estrictez, temas prohibidos, mensaje de rechazo).</w:t>
-            </w:r>
-          </w:p>
-        </w:tc>
-      </w:tr>
-      <w:tr>
-        <w:tc>
-          <w:tcPr>
-            <w:tcW w:w="3000" w:type="dxa"/>
-            <w:tcMar>
-              <w:top w:w="60" w:type="dxa"/>
-              <w:left w:w="120" w:type="dxa"/>
-              <w:bottom w:w="60" w:type="dxa"/>
-              <w:right w:w="120" w:type="dxa"/>
-            </w:tcMar>
-          </w:tcPr>
-          <w:p>
-            <w:pPr>
-              <w:spacing w:line="252" w:lineRule="auto"/>
-            </w:pPr>
-            <w:r>
-              <w:rPr>
-                <w:sz w:val="21"/>
-                <w:szCs w:val="21"/>
-              </w:rPr>
-              <w:t xml:space="preserve">RAG</w:t>
-            </w:r>
-          </w:p>
-        </w:tc>
-        <w:tc>
-          <w:tcPr>
-            <w:tcW w:w="6300" w:type="dxa"/>
-            <w:tcMar>
-              <w:top w:w="60" w:type="dxa"/>
-              <w:left w:w="120" w:type="dxa"/>
-              <w:bottom w:w="60" w:type="dxa"/>
-              <w:right w:w="120" w:type="dxa"/>
-            </w:tcMar>
-          </w:tcPr>
-          <w:p>
-            <w:pPr>
-              <w:spacing w:line="252" w:lineRule="auto"/>
-            </w:pPr>
-            <w:r>
-              <w:rPr>
-                <w:sz w:val="21"/>
-                <w:szCs w:val="21"/>
-              </w:rPr>
-              <w:t xml:space="preserve">Retrieval-Augmented Generation: técnica que combina búsqueda en documentos propios con generación de texto por LLM.</w:t>
-            </w:r>
-          </w:p>
-        </w:tc>
-      </w:tr>
-      <w:tr>
-        <w:tc>
-          <w:tcPr>
-            <w:tcW w:w="3000" w:type="dxa"/>
-            <w:tcMar>
-              <w:top w:w="60" w:type="dxa"/>
-              <w:left w:w="120" w:type="dxa"/>
-              <w:bottom w:w="60" w:type="dxa"/>
-              <w:right w:w="120" w:type="dxa"/>
-            </w:tcMar>
-          </w:tcPr>
-          <w:p>
-            <w:pPr>
-              <w:spacing w:line="252" w:lineRule="auto"/>
-            </w:pPr>
-            <w:r>
-              <w:rPr>
-                <w:sz w:val="21"/>
-                <w:szCs w:val="21"/>
-              </w:rPr>
-              <w:t xml:space="preserve">Sandbox</w:t>
-            </w:r>
-          </w:p>
-        </w:tc>
-        <w:tc>
-          <w:tcPr>
-            <w:tcW w:w="6300" w:type="dxa"/>
-            <w:tcMar>
-              <w:top w:w="60" w:type="dxa"/>
-              <w:left w:w="120" w:type="dxa"/>
-              <w:bottom w:w="60" w:type="dxa"/>
-              <w:right w:w="120" w:type="dxa"/>
-            </w:tcMar>
-          </w:tcPr>
-          <w:p>
-            <w:pPr>
-              <w:spacing w:line="252" w:lineRule="auto"/>
-            </w:pPr>
-            <w:r>
-              <w:rPr>
-                <w:sz w:val="21"/>
-                <w:szCs w:val="21"/>
-              </w:rPr>
-              <w:t xml:space="preserve">Espacio de prueba en vivo, aislado de las conversaciones reales.</w:t>
-            </w:r>
-          </w:p>
-        </w:tc>
-      </w:tr>
-      <w:tr>
-        <w:tc>
-          <w:tcPr>
-            <w:tcW w:w="3000" w:type="dxa"/>
-            <w:tcMar>
-              <w:top w:w="60" w:type="dxa"/>
-              <w:left w:w="120" w:type="dxa"/>
-              <w:bottom w:w="60" w:type="dxa"/>
-              <w:right w:w="120" w:type="dxa"/>
-            </w:tcMar>
-          </w:tcPr>
-          <w:p>
-            <w:pPr>
-              <w:spacing w:line="252" w:lineRule="auto"/>
-            </w:pPr>
-            <w:r>
-              <w:rPr>
-                <w:sz w:val="21"/>
-                <w:szCs w:val="21"/>
-              </w:rPr>
-              <w:t xml:space="preserve">Widget</w:t>
-            </w:r>
-          </w:p>
-        </w:tc>
-        <w:tc>
-          <w:tcPr>
-            <w:tcW w:w="6300" w:type="dxa"/>
-            <w:tcMar>
-              <w:top w:w="60" w:type="dxa"/>
-              <w:left w:w="120" w:type="dxa"/>
-              <w:bottom w:w="60" w:type="dxa"/>
-              <w:right w:w="120" w:type="dxa"/>
-            </w:tcMar>
-          </w:tcPr>
-          <w:p>
-            <w:pPr>
-              <w:spacing w:line="252" w:lineRule="auto"/>
-            </w:pPr>
-            <w:r>
-              <w:rPr>
-                <w:sz w:val="21"/>
-                <w:szCs w:val="21"/>
-              </w:rPr>
-              <w:t xml:space="preserve">Componente embebible que muestra el chatbot en un sitio externo.</w:t>
-            </w:r>
-          </w:p>
-        </w:tc>
-      </w:tr>
-      <w:tr>
-        <w:tc>
-          <w:tcPr>
-            <w:tcW w:w="3000" w:type="dxa"/>
-            <w:tcMar>
-              <w:top w:w="60" w:type="dxa"/>
-              <w:left w:w="120" w:type="dxa"/>
-              <w:bottom w:w="60" w:type="dxa"/>
-              <w:right w:w="120" w:type="dxa"/>
-            </w:tcMar>
-          </w:tcPr>
-          <w:p>
-            <w:pPr>
-              <w:spacing w:line="252" w:lineRule="auto"/>
-            </w:pPr>
-            <w:r>
-              <w:rPr>
-                <w:sz w:val="21"/>
-                <w:szCs w:val="21"/>
-              </w:rPr>
-              <w:t xml:space="preserve">Rol</w:t>
-            </w:r>
-          </w:p>
-        </w:tc>
-        <w:tc>
-          <w:tcPr>
-            <w:tcW w:w="6300" w:type="dxa"/>
-            <w:tcMar>
-              <w:top w:w="60" w:type="dxa"/>
-              <w:left w:w="120" w:type="dxa"/>
-              <w:bottom w:w="60" w:type="dxa"/>
-              <w:right w:w="120" w:type="dxa"/>
-            </w:tcMar>
-          </w:tcPr>
-          <w:p>
-            <w:pPr>
-              <w:spacing w:line="252" w:lineRule="auto"/>
-            </w:pPr>
-            <w:r>
-              <w:rPr>
-                <w:sz w:val="21"/>
-                <w:szCs w:val="21"/>
-              </w:rPr>
-              <w:t xml:space="preserve">Nivel de acceso del usuario dentro del panel (admin o user).</w:t>
+              <w:t xml:space="preserve">El panel de Observabilidad (sección 4.14) expone métricas reales de uso y satisfacción, usadas para decidir mejoras, no solo como adorno.</w:t>
             </w:r>
           </w:p>
         </w:tc>
@@ -5422,11 +5668,675 @@
       <w:pPr>
         <w:pStyle w:val="Ttulo1"/>
       </w:pPr>
-      <w:bookmarkStart w:id="1028" w:name="_Toc_CS_028"/>
-      <w:r>
-        <w:t>7. Aprobaciones</w:t>
-      </w:r>
-      <w:bookmarkEnd w:id="1028"/>
+      <w:bookmarkStart w:id="1029" w:name="_Toc_CS_029"/>
+      <w:r>
+        <w:t>7. Glosario de términos</w:t>
+      </w:r>
+      <w:bookmarkEnd w:id="1029"/>
+    </w:p>
+    <w:tbl>
+      <w:tblPr>
+        <w:tblW w:w="9300" w:type="dxa"/>
+        <w:tblBorders>
+          <w:top w:val="single" w:sz="4" w:space="0" w:color="AFC4DC"/>
+          <w:left w:val="single" w:sz="4" w:space="0" w:color="AFC4DC"/>
+          <w:bottom w:val="single" w:sz="4" w:space="0" w:color="AFC4DC"/>
+          <w:right w:val="single" w:sz="4" w:space="0" w:color="AFC4DC"/>
+          <w:insideH w:val="single" w:sz="4" w:space="0" w:color="D6E1EE"/>
+          <w:insideV w:val="single" w:sz="4" w:space="0" w:color="D6E1EE"/>
+        </w:tblBorders>
+        <w:tblCellMar>
+          <w:left w:w="10" w:type="dxa"/>
+          <w:right w:w="10" w:type="dxa"/>
+        </w:tblCellMar>
+        <w:tblLook w:val="04A0" w:firstRow="1" w:lastRow="0" w:firstColumn="1" w:lastColumn="0" w:noHBand="0" w:noVBand="1"/>
+      </w:tblPr>
+      <w:tblGrid>
+        <w:gridCol w:w="3000"/>
+        <w:gridCol w:w="6300"/>
+      </w:tblGrid>
+      <w:tr>
+        <w:trPr>
+          <w:tblHeader/>
+        </w:trPr>
+        <w:tc>
+          <w:tcPr>
+            <w:tcW w:w="3000" w:type="dxa"/>
+            <w:shd w:val="clear" w:color="auto" w:fill="DCEAF7"/>
+            <w:tcMar>
+              <w:top w:w="60" w:type="dxa"/>
+              <w:left w:w="120" w:type="dxa"/>
+              <w:bottom w:w="60" w:type="dxa"/>
+              <w:right w:w="120" w:type="dxa"/>
+            </w:tcMar>
+          </w:tcPr>
+          <w:p>
+            <w:pPr>
+              <w:spacing w:line="252" w:lineRule="auto"/>
+            </w:pPr>
+            <w:r>
+              <w:rPr>
+                <w:b/>
+                <w:bCs/>
+                <w:color w:val="14406F"/>
+                <w:sz w:val="21"/>
+                <w:szCs w:val="21"/>
+              </w:rPr>
+              <w:t xml:space="preserve">Término</w:t>
+            </w:r>
+          </w:p>
+        </w:tc>
+        <w:tc>
+          <w:tcPr>
+            <w:tcW w:w="6300" w:type="dxa"/>
+            <w:shd w:val="clear" w:color="auto" w:fill="DCEAF7"/>
+            <w:tcMar>
+              <w:top w:w="60" w:type="dxa"/>
+              <w:left w:w="120" w:type="dxa"/>
+              <w:bottom w:w="60" w:type="dxa"/>
+              <w:right w:w="120" w:type="dxa"/>
+            </w:tcMar>
+          </w:tcPr>
+          <w:p>
+            <w:pPr>
+              <w:spacing w:line="252" w:lineRule="auto"/>
+            </w:pPr>
+            <w:r>
+              <w:rPr>
+                <w:b/>
+                <w:bCs/>
+                <w:color w:val="14406F"/>
+                <w:sz w:val="21"/>
+                <w:szCs w:val="21"/>
+              </w:rPr>
+              <w:t xml:space="preserve">Definición</w:t>
+            </w:r>
+          </w:p>
+        </w:tc>
+      </w:tr>
+      <w:tr>
+        <w:tc>
+          <w:tcPr>
+            <w:tcW w:w="3000" w:type="dxa"/>
+            <w:tcMar>
+              <w:top w:w="60" w:type="dxa"/>
+              <w:left w:w="120" w:type="dxa"/>
+              <w:bottom w:w="60" w:type="dxa"/>
+              <w:right w:w="120" w:type="dxa"/>
+            </w:tcMar>
+          </w:tcPr>
+          <w:p>
+            <w:pPr>
+              <w:spacing w:line="252" w:lineRule="auto"/>
+            </w:pPr>
+            <w:r>
+              <w:rPr>
+                <w:sz w:val="21"/>
+                <w:szCs w:val="21"/>
+              </w:rPr>
+              <w:t xml:space="preserve">Authentik</w:t>
+            </w:r>
+          </w:p>
+        </w:tc>
+        <w:tc>
+          <w:tcPr>
+            <w:tcW w:w="6300" w:type="dxa"/>
+            <w:tcMar>
+              <w:top w:w="60" w:type="dxa"/>
+              <w:left w:w="120" w:type="dxa"/>
+              <w:bottom w:w="60" w:type="dxa"/>
+              <w:right w:w="120" w:type="dxa"/>
+            </w:tcMar>
+          </w:tcPr>
+          <w:p>
+            <w:pPr>
+              <w:spacing w:line="252" w:lineRule="auto"/>
+            </w:pPr>
+            <w:r>
+              <w:rPr>
+                <w:sz w:val="21"/>
+                <w:szCs w:val="21"/>
+              </w:rPr>
+              <w:t xml:space="preserve">Plataforma de gestión de identidad y acceso (SSO) que administra la autenticación de los usuarios en CASMARTS.</w:t>
+            </w:r>
+          </w:p>
+        </w:tc>
+      </w:tr>
+      <w:tr>
+        <w:tc>
+          <w:tcPr>
+            <w:tcW w:w="3000" w:type="dxa"/>
+            <w:tcMar>
+              <w:top w:w="60" w:type="dxa"/>
+              <w:left w:w="120" w:type="dxa"/>
+              <w:bottom w:w="60" w:type="dxa"/>
+              <w:right w:w="120" w:type="dxa"/>
+            </w:tcMar>
+          </w:tcPr>
+          <w:p>
+            <w:pPr>
+              <w:spacing w:line="252" w:lineRule="auto"/>
+            </w:pPr>
+            <w:r>
+              <w:rPr>
+                <w:sz w:val="21"/>
+                <w:szCs w:val="21"/>
+              </w:rPr>
+              <w:t xml:space="preserve">Tema / Perfil de chatbot</w:t>
+            </w:r>
+          </w:p>
+        </w:tc>
+        <w:tc>
+          <w:tcPr>
+            <w:tcW w:w="6300" w:type="dxa"/>
+            <w:tcMar>
+              <w:top w:w="60" w:type="dxa"/>
+              <w:left w:w="120" w:type="dxa"/>
+              <w:bottom w:w="60" w:type="dxa"/>
+              <w:right w:w="120" w:type="dxa"/>
+            </w:tcMar>
+          </w:tcPr>
+          <w:p>
+            <w:pPr>
+              <w:spacing w:line="252" w:lineRule="auto"/>
+            </w:pPr>
+            <w:r>
+              <w:rPr>
+                <w:sz w:val="21"/>
+                <w:szCs w:val="21"/>
+              </w:rPr>
+              <w:t xml:space="preserve">Registro de configuración de un chatbot (System Prompt, guardrails, apariencia).</w:t>
+            </w:r>
+          </w:p>
+        </w:tc>
+      </w:tr>
+      <w:tr>
+        <w:tc>
+          <w:tcPr>
+            <w:tcW w:w="3000" w:type="dxa"/>
+            <w:tcMar>
+              <w:top w:w="60" w:type="dxa"/>
+              <w:left w:w="120" w:type="dxa"/>
+              <w:bottom w:w="60" w:type="dxa"/>
+              <w:right w:w="120" w:type="dxa"/>
+            </w:tcMar>
+          </w:tcPr>
+          <w:p>
+            <w:pPr>
+              <w:spacing w:line="252" w:lineRule="auto"/>
+            </w:pPr>
+            <w:r>
+              <w:rPr>
+                <w:sz w:val="21"/>
+                <w:szCs w:val="21"/>
+              </w:rPr>
+              <w:t xml:space="preserve">System Prompt</w:t>
+            </w:r>
+          </w:p>
+        </w:tc>
+        <w:tc>
+          <w:tcPr>
+            <w:tcW w:w="6300" w:type="dxa"/>
+            <w:tcMar>
+              <w:top w:w="60" w:type="dxa"/>
+              <w:left w:w="120" w:type="dxa"/>
+              <w:bottom w:w="60" w:type="dxa"/>
+              <w:right w:w="120" w:type="dxa"/>
+            </w:tcMar>
+          </w:tcPr>
+          <w:p>
+            <w:pPr>
+              <w:spacing w:line="252" w:lineRule="auto"/>
+            </w:pPr>
+            <w:r>
+              <w:rPr>
+                <w:sz w:val="21"/>
+                <w:szCs w:val="21"/>
+              </w:rPr>
+              <w:t xml:space="preserve">Instrucción maestra que rige el comportamiento del chatbot.</w:t>
+            </w:r>
+          </w:p>
+        </w:tc>
+      </w:tr>
+      <w:tr>
+        <w:tc>
+          <w:tcPr>
+            <w:tcW w:w="3000" w:type="dxa"/>
+            <w:tcMar>
+              <w:top w:w="60" w:type="dxa"/>
+              <w:left w:w="120" w:type="dxa"/>
+              <w:bottom w:w="60" w:type="dxa"/>
+              <w:right w:w="120" w:type="dxa"/>
+            </w:tcMar>
+          </w:tcPr>
+          <w:p>
+            <w:pPr>
+              <w:spacing w:line="252" w:lineRule="auto"/>
+            </w:pPr>
+            <w:r>
+              <w:rPr>
+                <w:sz w:val="21"/>
+                <w:szCs w:val="21"/>
+              </w:rPr>
+              <w:t xml:space="preserve">CRAFT / CREA / ASPECCT</w:t>
+            </w:r>
+          </w:p>
+        </w:tc>
+        <w:tc>
+          <w:tcPr>
+            <w:tcW w:w="6300" w:type="dxa"/>
+            <w:tcMar>
+              <w:top w:w="60" w:type="dxa"/>
+              <w:left w:w="120" w:type="dxa"/>
+              <w:bottom w:w="60" w:type="dxa"/>
+              <w:right w:w="120" w:type="dxa"/>
+            </w:tcMar>
+          </w:tcPr>
+          <w:p>
+            <w:pPr>
+              <w:spacing w:line="252" w:lineRule="auto"/>
+            </w:pPr>
+            <w:r>
+              <w:rPr>
+                <w:sz w:val="21"/>
+                <w:szCs w:val="21"/>
+              </w:rPr>
+              <w:t xml:space="preserve">Metodologías de meta-prompting para estructurar el System Prompt.</w:t>
+            </w:r>
+          </w:p>
+        </w:tc>
+      </w:tr>
+      <w:tr>
+        <w:tc>
+          <w:tcPr>
+            <w:tcW w:w="3000" w:type="dxa"/>
+            <w:tcMar>
+              <w:top w:w="60" w:type="dxa"/>
+              <w:left w:w="120" w:type="dxa"/>
+              <w:bottom w:w="60" w:type="dxa"/>
+              <w:right w:w="120" w:type="dxa"/>
+            </w:tcMar>
+          </w:tcPr>
+          <w:p>
+            <w:pPr>
+              <w:spacing w:line="252" w:lineRule="auto"/>
+            </w:pPr>
+            <w:r>
+              <w:rPr>
+                <w:sz w:val="21"/>
+                <w:szCs w:val="21"/>
+              </w:rPr>
+              <w:t xml:space="preserve">Guardrail</w:t>
+            </w:r>
+          </w:p>
+        </w:tc>
+        <w:tc>
+          <w:tcPr>
+            <w:tcW w:w="6300" w:type="dxa"/>
+            <w:tcMar>
+              <w:top w:w="60" w:type="dxa"/>
+              <w:left w:w="120" w:type="dxa"/>
+              <w:bottom w:w="60" w:type="dxa"/>
+              <w:right w:w="120" w:type="dxa"/>
+            </w:tcMar>
+          </w:tcPr>
+          <w:p>
+            <w:pPr>
+              <w:spacing w:line="252" w:lineRule="auto"/>
+            </w:pPr>
+            <w:r>
+              <w:rPr>
+                <w:sz w:val="21"/>
+                <w:szCs w:val="21"/>
+              </w:rPr>
+              <w:t xml:space="preserve">Control que delimita el dominio de respuesta del chatbot (estrictez, temas prohibidos, mensaje de rechazo).</w:t>
+            </w:r>
+          </w:p>
+        </w:tc>
+      </w:tr>
+      <w:tr>
+        <w:tc>
+          <w:tcPr>
+            <w:tcW w:w="3000" w:type="dxa"/>
+            <w:tcMar>
+              <w:top w:w="60" w:type="dxa"/>
+              <w:left w:w="120" w:type="dxa"/>
+              <w:bottom w:w="60" w:type="dxa"/>
+              <w:right w:w="120" w:type="dxa"/>
+            </w:tcMar>
+          </w:tcPr>
+          <w:p>
+            <w:pPr>
+              <w:spacing w:line="252" w:lineRule="auto"/>
+            </w:pPr>
+            <w:r>
+              <w:rPr>
+                <w:sz w:val="21"/>
+                <w:szCs w:val="21"/>
+              </w:rPr>
+              <w:t xml:space="preserve">RAG</w:t>
+            </w:r>
+          </w:p>
+        </w:tc>
+        <w:tc>
+          <w:tcPr>
+            <w:tcW w:w="6300" w:type="dxa"/>
+            <w:tcMar>
+              <w:top w:w="60" w:type="dxa"/>
+              <w:left w:w="120" w:type="dxa"/>
+              <w:bottom w:w="60" w:type="dxa"/>
+              <w:right w:w="120" w:type="dxa"/>
+            </w:tcMar>
+          </w:tcPr>
+          <w:p>
+            <w:pPr>
+              <w:spacing w:line="252" w:lineRule="auto"/>
+            </w:pPr>
+            <w:r>
+              <w:rPr>
+                <w:sz w:val="21"/>
+                <w:szCs w:val="21"/>
+              </w:rPr>
+              <w:t xml:space="preserve">Retrieval-Augmented Generation: técnica que combina búsqueda en documentos propios con generación de texto por LLM.</w:t>
+            </w:r>
+          </w:p>
+        </w:tc>
+      </w:tr>
+      <w:tr>
+        <w:tc>
+          <w:tcPr>
+            <w:tcW w:w="3000" w:type="dxa"/>
+            <w:tcMar>
+              <w:top w:w="60" w:type="dxa"/>
+              <w:left w:w="120" w:type="dxa"/>
+              <w:bottom w:w="60" w:type="dxa"/>
+              <w:right w:w="120" w:type="dxa"/>
+            </w:tcMar>
+          </w:tcPr>
+          <w:p>
+            <w:pPr>
+              <w:spacing w:line="252" w:lineRule="auto"/>
+            </w:pPr>
+            <w:r>
+              <w:rPr>
+                <w:sz w:val="21"/>
+                <w:szCs w:val="21"/>
+              </w:rPr>
+              <w:t xml:space="preserve">Sandbox</w:t>
+            </w:r>
+          </w:p>
+        </w:tc>
+        <w:tc>
+          <w:tcPr>
+            <w:tcW w:w="6300" w:type="dxa"/>
+            <w:tcMar>
+              <w:top w:w="60" w:type="dxa"/>
+              <w:left w:w="120" w:type="dxa"/>
+              <w:bottom w:w="60" w:type="dxa"/>
+              <w:right w:w="120" w:type="dxa"/>
+            </w:tcMar>
+          </w:tcPr>
+          <w:p>
+            <w:pPr>
+              <w:spacing w:line="252" w:lineRule="auto"/>
+            </w:pPr>
+            <w:r>
+              <w:rPr>
+                <w:sz w:val="21"/>
+                <w:szCs w:val="21"/>
+              </w:rPr>
+              <w:t xml:space="preserve">Espacio de prueba en vivo, aislado de las conversaciones reales.</w:t>
+            </w:r>
+          </w:p>
+        </w:tc>
+      </w:tr>
+      <w:tr>
+        <w:tc>
+          <w:tcPr>
+            <w:tcW w:w="3000" w:type="dxa"/>
+            <w:tcMar>
+              <w:top w:w="60" w:type="dxa"/>
+              <w:left w:w="120" w:type="dxa"/>
+              <w:bottom w:w="60" w:type="dxa"/>
+              <w:right w:w="120" w:type="dxa"/>
+            </w:tcMar>
+          </w:tcPr>
+          <w:p>
+            <w:pPr>
+              <w:spacing w:line="252" w:lineRule="auto"/>
+            </w:pPr>
+            <w:r>
+              <w:rPr>
+                <w:sz w:val="21"/>
+                <w:szCs w:val="21"/>
+              </w:rPr>
+              <w:t xml:space="preserve">Widget</w:t>
+            </w:r>
+          </w:p>
+        </w:tc>
+        <w:tc>
+          <w:tcPr>
+            <w:tcW w:w="6300" w:type="dxa"/>
+            <w:tcMar>
+              <w:top w:w="60" w:type="dxa"/>
+              <w:left w:w="120" w:type="dxa"/>
+              <w:bottom w:w="60" w:type="dxa"/>
+              <w:right w:w="120" w:type="dxa"/>
+            </w:tcMar>
+          </w:tcPr>
+          <w:p>
+            <w:pPr>
+              <w:spacing w:line="252" w:lineRule="auto"/>
+            </w:pPr>
+            <w:r>
+              <w:rPr>
+                <w:sz w:val="21"/>
+                <w:szCs w:val="21"/>
+              </w:rPr>
+              <w:t xml:space="preserve">Componente embebible que muestra el chatbot en un sitio externo.</w:t>
+            </w:r>
+          </w:p>
+        </w:tc>
+      </w:tr>
+      <w:tr>
+        <w:tc>
+          <w:tcPr>
+            <w:tcW w:w="3000" w:type="dxa"/>
+            <w:tcMar>
+              <w:top w:w="60" w:type="dxa"/>
+              <w:left w:w="120" w:type="dxa"/>
+              <w:bottom w:w="60" w:type="dxa"/>
+              <w:right w:w="120" w:type="dxa"/>
+            </w:tcMar>
+          </w:tcPr>
+          <w:p>
+            <w:pPr>
+              <w:spacing w:line="252" w:lineRule="auto"/>
+            </w:pPr>
+            <w:r>
+              <w:rPr>
+                <w:sz w:val="21"/>
+                <w:szCs w:val="21"/>
+              </w:rPr>
+              <w:t xml:space="preserve">Rol</w:t>
+            </w:r>
+          </w:p>
+        </w:tc>
+        <w:tc>
+          <w:tcPr>
+            <w:tcW w:w="6300" w:type="dxa"/>
+            <w:tcMar>
+              <w:top w:w="60" w:type="dxa"/>
+              <w:left w:w="120" w:type="dxa"/>
+              <w:bottom w:w="60" w:type="dxa"/>
+              <w:right w:w="120" w:type="dxa"/>
+            </w:tcMar>
+          </w:tcPr>
+          <w:p>
+            <w:pPr>
+              <w:spacing w:line="252" w:lineRule="auto"/>
+            </w:pPr>
+            <w:r>
+              <w:rPr>
+                <w:sz w:val="21"/>
+                <w:szCs w:val="21"/>
+              </w:rPr>
+              <w:t xml:space="preserve">Nivel de acceso del usuario dentro del panel (admin o user).</w:t>
+            </w:r>
+          </w:p>
+        </w:tc>
+      </w:tr>
+      <w:tr>
+        <w:tc>
+          <w:tcPr>
+            <w:tcW w:w="3000" w:type="dxa"/>
+            <w:tcMar>
+              <w:top w:w="60" w:type="dxa"/>
+              <w:left w:w="120" w:type="dxa"/>
+              <w:bottom w:w="60" w:type="dxa"/>
+              <w:right w:w="120" w:type="dxa"/>
+            </w:tcMar>
+          </w:tcPr>
+          <w:p>
+            <w:pPr>
+              <w:spacing w:line="252" w:lineRule="auto"/>
+            </w:pPr>
+            <w:r>
+              <w:rPr>
+                <w:sz w:val="21"/>
+                <w:szCs w:val="21"/>
+              </w:rPr>
+              <w:t xml:space="preserve">CMMI</w:t>
+            </w:r>
+          </w:p>
+        </w:tc>
+        <w:tc>
+          <w:tcPr>
+            <w:tcW w:w="6300" w:type="dxa"/>
+            <w:tcMar>
+              <w:top w:w="60" w:type="dxa"/>
+              <w:left w:w="120" w:type="dxa"/>
+              <w:bottom w:w="60" w:type="dxa"/>
+              <w:right w:w="120" w:type="dxa"/>
+            </w:tcMar>
+          </w:tcPr>
+          <w:p>
+            <w:pPr>
+              <w:spacing w:line="252" w:lineRule="auto"/>
+            </w:pPr>
+            <w:r>
+              <w:rPr>
+                <w:sz w:val="21"/>
+                <w:szCs w:val="21"/>
+              </w:rPr>
+              <w:t xml:space="preserve">Capability Maturity Model Integration: modelo de prácticas para gestionar la calidad y madurez de procesos de un proyecto (ver sección 6).</w:t>
+            </w:r>
+          </w:p>
+        </w:tc>
+      </w:tr>
+      <w:tr>
+        <w:tc>
+          <w:tcPr>
+            <w:tcW w:w="3000" w:type="dxa"/>
+            <w:tcMar>
+              <w:top w:w="60" w:type="dxa"/>
+              <w:left w:w="120" w:type="dxa"/>
+              <w:bottom w:w="60" w:type="dxa"/>
+              <w:right w:w="120" w:type="dxa"/>
+            </w:tcMar>
+          </w:tcPr>
+          <w:p>
+            <w:pPr>
+              <w:spacing w:line="252" w:lineRule="auto"/>
+            </w:pPr>
+            <w:r>
+              <w:rPr>
+                <w:sz w:val="21"/>
+                <w:szCs w:val="21"/>
+              </w:rPr>
+              <w:t xml:space="preserve">Bitácora de cambios / Historial</w:t>
+            </w:r>
+          </w:p>
+        </w:tc>
+        <w:tc>
+          <w:tcPr>
+            <w:tcW w:w="6300" w:type="dxa"/>
+            <w:tcMar>
+              <w:top w:w="60" w:type="dxa"/>
+              <w:left w:w="120" w:type="dxa"/>
+              <w:bottom w:w="60" w:type="dxa"/>
+              <w:right w:w="120" w:type="dxa"/>
+            </w:tcMar>
+          </w:tcPr>
+          <w:p>
+            <w:pPr>
+              <w:spacing w:line="252" w:lineRule="auto"/>
+            </w:pPr>
+            <w:r>
+              <w:rPr>
+                <w:sz w:val="21"/>
+                <w:szCs w:val="21"/>
+              </w:rPr>
+              <w:t xml:space="preserve">Registro de creaciones, ediciones, eliminaciones y restauraciones de un tema, con quién y cuándo.</w:t>
+            </w:r>
+          </w:p>
+        </w:tc>
+      </w:tr>
+      <w:tr>
+        <w:tc>
+          <w:tcPr>
+            <w:tcW w:type="dxa" w:w="3000"/>
+          </w:tcPr>
+          <w:p>
+            <w:r>
+              <w:t>Ollama</w:t>
+            </w:r>
+          </w:p>
+        </w:tc>
+        <w:tc>
+          <w:tcPr>
+            <w:tcW w:type="dxa" w:w="6300"/>
+          </w:tcPr>
+          <w:p>
+            <w:r>
+              <w:t>Motor de IA que corre en un servidor local o on-premise propio, en vez de un servicio en la nube; se configura por tema con un Endpoint/Base URL en vez de una clave de API.</w:t>
+            </w:r>
+          </w:p>
+        </w:tc>
+      </w:tr>
+      <w:tr>
+        <w:tc>
+          <w:tcPr>
+            <w:tcW w:type="dxa" w:w="3000"/>
+          </w:tcPr>
+          <w:p>
+            <w:r>
+              <w:t>Catálogo de modelos en vivo</w:t>
+            </w:r>
+          </w:p>
+        </w:tc>
+        <w:tc>
+          <w:tcPr>
+            <w:tcW w:type="dxa" w:w="6300"/>
+          </w:tcPr>
+          <w:p>
+            <w:r>
+              <w:t>Lista de modelos que el panel consulta directamente al proveedor de IA en el momento (botón “Cargar modelos disponibles”), en vez de una lista fija que puede quedar desactualizada.</w:t>
+            </w:r>
+          </w:p>
+        </w:tc>
+      </w:tr>
+    </w:tbl>
+    <w:p/>
+    <w:p>
+      <w:pPr>
+        <w:pStyle w:val="Ttulo1"/>
+      </w:pPr>
+      <w:bookmarkStart w:id="1030" w:name="_Toc_CS_030"/>
+      <w:r>
+        <w:t>8. Aprobaciones</w:t>
+      </w:r>
+      <w:bookmarkEnd w:id="1030"/>
     </w:p>
     <w:tbl>
       <w:tblPr>
@@ -5755,11 +6665,11 @@
       <w:pPr>
         <w:pStyle w:val="Ttulo2"/>
       </w:pPr>
-      <w:bookmarkStart w:id="1029" w:name="_Toc_CS_029"/>
+      <w:bookmarkStart w:id="1031" w:name="_Toc_CS_031"/>
       <w:r>
         <w:t>Control de versiones</w:t>
       </w:r>
-      <w:bookmarkEnd w:id="1029"/>
+      <w:bookmarkEnd w:id="1031"/>
     </w:p>
     <w:tbl>
       <w:tblPr>
@@ -6081,6 +6991,184 @@
                 <w:szCs w:val="21"/>
               </w:rPr>
               <w:t xml:space="preserve">Se documentan las funcionalidades de la segunda ronda de implementación: LLM personalizado por tema (con clave de API cifrada), Batería de Regresión de Prompts (4.13) y Observabilidad del motor de IA (4.14), además de un paso nuevo en Parámetros del tema (4.5) para configurar el proveedor de IA personalizado.</w:t>
+            </w:r>
+          </w:p>
+        </w:tc>
+      </w:tr>
+      <w:tr>
+        <w:tc>
+          <w:tcPr>
+            <w:tcW w:w="1300" w:type="dxa"/>
+            <w:tcMar>
+              <w:top w:w="60" w:type="dxa"/>
+              <w:left w:w="120" w:type="dxa"/>
+              <w:bottom w:w="60" w:type="dxa"/>
+              <w:right w:w="120" w:type="dxa"/>
+            </w:tcMar>
+          </w:tcPr>
+          <w:p>
+            <w:pPr>
+              <w:spacing w:line="252" w:lineRule="auto"/>
+            </w:pPr>
+            <w:r>
+              <w:rPr>
+                <w:sz w:val="21"/>
+                <w:szCs w:val="21"/>
+              </w:rPr>
+              <w:t xml:space="preserve">1.2</w:t>
+            </w:r>
+          </w:p>
+        </w:tc>
+        <w:tc>
+          <w:tcPr>
+            <w:tcW w:w="1600" w:type="dxa"/>
+            <w:tcMar>
+              <w:top w:w="60" w:type="dxa"/>
+              <w:left w:w="120" w:type="dxa"/>
+              <w:bottom w:w="60" w:type="dxa"/>
+              <w:right w:w="120" w:type="dxa"/>
+            </w:tcMar>
+          </w:tcPr>
+          <w:p>
+            <w:pPr>
+              <w:spacing w:line="252" w:lineRule="auto"/>
+            </w:pPr>
+            <w:r>
+              <w:rPr>
+                <w:sz w:val="21"/>
+                <w:szCs w:val="21"/>
+              </w:rPr>
+              <w:t xml:space="preserve">22/07/2026</w:t>
+            </w:r>
+          </w:p>
+        </w:tc>
+        <w:tc>
+          <w:tcPr>
+            <w:tcW w:w="2800" w:type="dxa"/>
+            <w:tcMar>
+              <w:top w:w="60" w:type="dxa"/>
+              <w:left w:w="120" w:type="dxa"/>
+              <w:bottom w:w="60" w:type="dxa"/>
+              <w:right w:w="120" w:type="dxa"/>
+            </w:tcMar>
+          </w:tcPr>
+          <w:p>
+            <w:pPr>
+              <w:spacing w:line="252" w:lineRule="auto"/>
+            </w:pPr>
+            <w:r>
+              <w:rPr>
+                <w:sz w:val="21"/>
+                <w:szCs w:val="21"/>
+              </w:rPr>
+              <w:t xml:space="preserve">Israel Martínez Hernández (asistido por Claude)</w:t>
+            </w:r>
+          </w:p>
+        </w:tc>
+        <w:tc>
+          <w:tcPr>
+            <w:tcW w:w="3600" w:type="dxa"/>
+            <w:tcMar>
+              <w:top w:w="60" w:type="dxa"/>
+              <w:left w:w="120" w:type="dxa"/>
+              <w:bottom w:w="60" w:type="dxa"/>
+              <w:right w:w="120" w:type="dxa"/>
+            </w:tcMar>
+          </w:tcPr>
+          <w:p>
+            <w:pPr>
+              <w:spacing w:line="252" w:lineRule="auto"/>
+            </w:pPr>
+            <w:r>
+              <w:rPr>
+                <w:sz w:val="21"/>
+                <w:szCs w:val="21"/>
+              </w:rPr>
+              <w:t xml:space="preserve">Se documenta el Historial de Cambios y Restauración de un tema (4.15), la condición de solo lectura del tema "general" (4.1/4.2), y se agrega la sección 6 "Cumplimiento de Estándares (CMMI)" resumiendo para el administrador qué prácticas de madurez de proceso cubre el sistema.</w:t>
+            </w:r>
+          </w:p>
+        </w:tc>
+      </w:tr>
+      <w:tr>
+        <w:tc>
+          <w:tcPr>
+            <w:tcW w:type="dxa" w:w="1300"/>
+          </w:tcPr>
+          <w:p>
+            <w:r>
+              <w:t>1.3</w:t>
+            </w:r>
+          </w:p>
+        </w:tc>
+        <w:tc>
+          <w:tcPr>
+            <w:tcW w:type="dxa" w:w="1600"/>
+          </w:tcPr>
+          <w:p>
+            <w:r>
+              <w:t>29/07/2026</w:t>
+            </w:r>
+          </w:p>
+        </w:tc>
+        <w:tc>
+          <w:tcPr>
+            <w:tcW w:type="dxa" w:w="2800"/>
+          </w:tcPr>
+          <w:p>
+            <w:r>
+              <w:t>Israel Martínez Hernández (asistido por Claude)</w:t>
+            </w:r>
+          </w:p>
+        </w:tc>
+        <w:tc>
+          <w:tcPr>
+            <w:tcW w:type="dxa" w:w="3600"/>
+          </w:tcPr>
+          <w:p>
+            <w:r>
+              <w:t>Se reubica Guardrails justo debajo del System Prompt generado (4.4/4.6) y el generador de prompts ahora incorpora los Temas Prohibidos y el Mensaje de Rechazo ya configurados. Se documenta la implementación completa del motor de IA por tema (Ollama, Anthropic y Mistral, antes solo visibles en el selector sin funcionar), el campo Endpoint/Base URL y el catálogo de modelos cargado en vivo desde cada proveedor (4.5).</w:t>
+            </w:r>
+          </w:p>
+        </w:tc>
+      </w:tr>
+      <w:tr>
+        <w:tc>
+          <w:tcPr>
+            <w:tcW w:type="dxa" w:w="1300"/>
+          </w:tcPr>
+          <w:p>
+            <w:r>
+              <w:t>1.4</w:t>
+            </w:r>
+          </w:p>
+        </w:tc>
+        <w:tc>
+          <w:tcPr>
+            <w:tcW w:type="dxa" w:w="1600"/>
+          </w:tcPr>
+          <w:p>
+            <w:r>
+              <w:t>29/07/2026</w:t>
+            </w:r>
+          </w:p>
+        </w:tc>
+        <w:tc>
+          <w:tcPr>
+            <w:tcW w:type="dxa" w:w="2800"/>
+          </w:tcPr>
+          <w:p>
+            <w:r>
+              <w:t>Israel Martínez Hernández (asistido por Claude)</w:t>
+            </w:r>
+          </w:p>
+        </w:tc>
+        <w:tc>
+          <w:tcPr>
+            <w:tcW w:type="dxa" w:w="3600"/>
+          </w:tcPr>
+          <w:p>
+            <w:r>
+              <w:t>Se documenta la detección de conflictos de edición concurrente: si dos administradores editan el mismo tema a la vez, el sistema avisa en vez de sobreescribir en silencio (sección de Preguntas frecuentes).</w:t>
             </w:r>
           </w:p>
         </w:tc>

</xml_diff>